<commit_message>
Ajustar tamañao de cuadro de texto en el template
</commit_message>
<xml_diff>
--- a/backend/templates/resguardo_template.docx
+++ b/backend/templates/resguardo_template.docx
@@ -56,7 +56,7 @@
                 <w:lang w:val="es-MX" w:eastAsia="es-MX"/>
               </w:rPr>
               <w:drawing>
-                <wp:anchor distT="0" distB="0" distL="114300" distR="114300" simplePos="0" relativeHeight="251709952" behindDoc="0" locked="0" layoutInCell="1" allowOverlap="1" wp14:anchorId="1978547C" wp14:editId="032F09CE">
+                <wp:anchor distT="0" distB="0" distL="114300" distR="114300" simplePos="0" relativeHeight="251658340" behindDoc="0" locked="0" layoutInCell="1" allowOverlap="1" wp14:anchorId="1978547C" wp14:editId="420AEB00">
                   <wp:simplePos x="0" y="0"/>
                   <wp:positionH relativeFrom="column">
                     <wp:posOffset>92710</wp:posOffset>
@@ -1254,7 +1254,7 @@
               <mc:AlternateContent>
                 <mc:Choice Requires="wps">
                   <w:drawing>
-                    <wp:anchor distT="0" distB="0" distL="114300" distR="114300" simplePos="0" relativeHeight="251605504" behindDoc="0" locked="0" layoutInCell="1" allowOverlap="1" wp14:anchorId="4558F964" wp14:editId="6DE0975B">
+                    <wp:anchor distT="0" distB="0" distL="114300" distR="114300" simplePos="0" relativeHeight="251658240" behindDoc="0" locked="0" layoutInCell="1" allowOverlap="1" wp14:anchorId="4558F964" wp14:editId="6DE0975B">
                       <wp:simplePos x="0" y="0"/>
                       <wp:positionH relativeFrom="column">
                         <wp:posOffset>2012950</wp:posOffset>
@@ -1365,7 +1365,7 @@
               <mc:AlternateContent>
                 <mc:Choice Requires="wps">
                   <w:drawing>
-                    <wp:anchor distT="0" distB="0" distL="114300" distR="114300" simplePos="0" relativeHeight="251618816" behindDoc="0" locked="0" layoutInCell="1" allowOverlap="1" wp14:anchorId="11712805" wp14:editId="33AB7305">
+                    <wp:anchor distT="0" distB="0" distL="114300" distR="114300" simplePos="0" relativeHeight="251658251" behindDoc="0" locked="0" layoutInCell="1" allowOverlap="1" wp14:anchorId="11712805" wp14:editId="33AB7305">
                       <wp:simplePos x="0" y="0"/>
                       <wp:positionH relativeFrom="column">
                         <wp:posOffset>1778000</wp:posOffset>
@@ -1500,7 +1500,7 @@
               <mc:AlternateContent>
                 <mc:Choice Requires="wps">
                   <w:drawing>
-                    <wp:anchor distT="0" distB="0" distL="114300" distR="114300" simplePos="0" relativeHeight="251606528" behindDoc="0" locked="0" layoutInCell="1" allowOverlap="1" wp14:anchorId="56FF8EF2" wp14:editId="703C9ED6">
+                    <wp:anchor distT="0" distB="0" distL="114300" distR="114300" simplePos="0" relativeHeight="251658241" behindDoc="0" locked="0" layoutInCell="1" allowOverlap="1" wp14:anchorId="56FF8EF2" wp14:editId="703C9ED6">
                       <wp:simplePos x="0" y="0"/>
                       <wp:positionH relativeFrom="column">
                         <wp:posOffset>2012950</wp:posOffset>
@@ -1600,7 +1600,7 @@
               <mc:AlternateContent>
                 <mc:Choice Requires="wps">
                   <w:drawing>
-                    <wp:anchor distT="0" distB="0" distL="114300" distR="114300" simplePos="0" relativeHeight="251616768" behindDoc="0" locked="0" layoutInCell="1" allowOverlap="1" wp14:anchorId="495BCEB9" wp14:editId="0815151F">
+                    <wp:anchor distT="0" distB="0" distL="114300" distR="114300" simplePos="0" relativeHeight="251658249" behindDoc="0" locked="0" layoutInCell="1" allowOverlap="1" wp14:anchorId="495BCEB9" wp14:editId="0815151F">
                       <wp:simplePos x="0" y="0"/>
                       <wp:positionH relativeFrom="column">
                         <wp:posOffset>1787525</wp:posOffset>
@@ -1920,7 +1920,7 @@
               <mc:AlternateContent>
                 <mc:Choice Requires="wps">
                   <w:drawing>
-                    <wp:anchor distT="0" distB="0" distL="114300" distR="114300" simplePos="0" relativeHeight="251615744" behindDoc="0" locked="0" layoutInCell="1" allowOverlap="1" wp14:anchorId="4BA48A11" wp14:editId="02518B04">
+                    <wp:anchor distT="0" distB="0" distL="114300" distR="114300" simplePos="0" relativeHeight="251658248" behindDoc="0" locked="0" layoutInCell="1" allowOverlap="1" wp14:anchorId="4BA48A11" wp14:editId="02518B04">
                       <wp:simplePos x="0" y="0"/>
                       <wp:positionH relativeFrom="column">
                         <wp:posOffset>3042866</wp:posOffset>
@@ -2024,7 +2024,7 @@
               <mc:AlternateContent>
                 <mc:Choice Requires="wps">
                   <w:drawing>
-                    <wp:anchor distT="0" distB="0" distL="114300" distR="114300" simplePos="0" relativeHeight="251610624" behindDoc="0" locked="0" layoutInCell="1" allowOverlap="1" wp14:anchorId="1A30102C" wp14:editId="40E93AEE">
+                    <wp:anchor distT="0" distB="0" distL="114300" distR="114300" simplePos="0" relativeHeight="251658243" behindDoc="0" locked="0" layoutInCell="1" allowOverlap="1" wp14:anchorId="1A30102C" wp14:editId="40E93AEE">
                       <wp:simplePos x="0" y="0"/>
                       <wp:positionH relativeFrom="column">
                         <wp:posOffset>3270250</wp:posOffset>
@@ -2135,7 +2135,7 @@
               <mc:AlternateContent>
                 <mc:Choice Requires="wps">
                   <w:drawing>
-                    <wp:anchor distT="0" distB="0" distL="114300" distR="114300" simplePos="0" relativeHeight="251614720" behindDoc="0" locked="0" layoutInCell="1" allowOverlap="1" wp14:anchorId="4E869939" wp14:editId="1CB0F49A">
+                    <wp:anchor distT="0" distB="0" distL="114300" distR="114300" simplePos="0" relativeHeight="251658247" behindDoc="0" locked="0" layoutInCell="1" allowOverlap="1" wp14:anchorId="4E869939" wp14:editId="1CB0F49A">
                       <wp:simplePos x="0" y="0"/>
                       <wp:positionH relativeFrom="column">
                         <wp:posOffset>3038475</wp:posOffset>
@@ -2227,7 +2227,7 @@
               <mc:AlternateContent>
                 <mc:Choice Requires="wps">
                   <w:drawing>
-                    <wp:anchor distT="0" distB="0" distL="114300" distR="114300" simplePos="0" relativeHeight="251609600" behindDoc="0" locked="0" layoutInCell="1" allowOverlap="1" wp14:anchorId="1682EF05" wp14:editId="30C9D8CC">
+                    <wp:anchor distT="0" distB="0" distL="114300" distR="114300" simplePos="0" relativeHeight="251658242" behindDoc="0" locked="0" layoutInCell="1" allowOverlap="1" wp14:anchorId="1682EF05" wp14:editId="30C9D8CC">
                       <wp:simplePos x="0" y="0"/>
                       <wp:positionH relativeFrom="column">
                         <wp:posOffset>3047365</wp:posOffset>
@@ -2333,7 +2333,7 @@
               <mc:AlternateContent>
                 <mc:Choice Requires="wps">
                   <w:drawing>
-                    <wp:anchor distT="0" distB="0" distL="114300" distR="114300" simplePos="0" relativeHeight="251613696" behindDoc="0" locked="0" layoutInCell="1" allowOverlap="1" wp14:anchorId="0D4ECDF5" wp14:editId="233FD7A5">
+                    <wp:anchor distT="0" distB="0" distL="114300" distR="114300" simplePos="0" relativeHeight="251658246" behindDoc="0" locked="0" layoutInCell="1" allowOverlap="1" wp14:anchorId="0D4ECDF5" wp14:editId="233FD7A5">
                       <wp:simplePos x="0" y="0"/>
                       <wp:positionH relativeFrom="column">
                         <wp:posOffset>3270250</wp:posOffset>
@@ -2425,7 +2425,7 @@
               <mc:AlternateContent>
                 <mc:Choice Requires="wps">
                   <w:drawing>
-                    <wp:anchor distT="0" distB="0" distL="114300" distR="114300" simplePos="0" relativeHeight="251611648" behindDoc="0" locked="0" layoutInCell="1" allowOverlap="1" wp14:anchorId="6340A2C8" wp14:editId="41B1B90C">
+                    <wp:anchor distT="0" distB="0" distL="114300" distR="114300" simplePos="0" relativeHeight="251658244" behindDoc="0" locked="0" layoutInCell="1" allowOverlap="1" wp14:anchorId="6340A2C8" wp14:editId="41B1B90C">
                       <wp:simplePos x="0" y="0"/>
                       <wp:positionH relativeFrom="column">
                         <wp:posOffset>3270250</wp:posOffset>
@@ -10110,7 +10110,7 @@
         <mc:AlternateContent>
           <mc:Choice Requires="wps">
             <w:drawing>
-              <wp:anchor distT="0" distB="0" distL="114300" distR="114300" simplePos="0" relativeHeight="251617792" behindDoc="0" locked="0" layoutInCell="1" allowOverlap="1" wp14:anchorId="3DE21F80" wp14:editId="26DF530F">
+              <wp:anchor distT="0" distB="0" distL="114300" distR="114300" simplePos="0" relativeHeight="251658250" behindDoc="0" locked="0" layoutInCell="1" allowOverlap="1" wp14:anchorId="3DE21F80" wp14:editId="26DF530F">
                 <wp:simplePos x="0" y="0"/>
                 <wp:positionH relativeFrom="column">
                   <wp:posOffset>1021797</wp:posOffset>
@@ -10185,7 +10185,7 @@
           </mc:Choice>
           <mc:Fallback>
             <w:pict>
-              <v:rect w14:anchorId="3DE21F80" id="Rectángulo 191" o:spid="_x0000_s1026" style="position:absolute;left:0;text-align:left;margin-left:80.45pt;margin-top:.3pt;width:282pt;height:35.55pt;z-index:251617792;visibility:visible;mso-wrap-style:square;mso-width-percent:0;mso-height-percent:0;mso-wrap-distance-left:9pt;mso-wrap-distance-top:0;mso-wrap-distance-right:9pt;mso-wrap-distance-bottom:0;mso-position-horizontal:absolute;mso-position-horizontal-relative:text;mso-position-vertical:absolute;mso-position-vertical-relative:text;mso-width-percent:0;mso-height-percent:0;mso-width-relative:page;mso-height-relative:page;v-text-anchor:top" o:gfxdata="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">
+              <v:rect w14:anchorId="3DE21F80" id="Rectángulo 191" o:spid="_x0000_s1026" style="position:absolute;left:0;text-align:left;margin-left:80.45pt;margin-top:.3pt;width:282pt;height:35.55pt;z-index:251658250;visibility:visible;mso-wrap-style:square;mso-width-percent:0;mso-height-percent:0;mso-wrap-distance-left:9pt;mso-wrap-distance-top:0;mso-wrap-distance-right:9pt;mso-wrap-distance-bottom:0;mso-position-horizontal:absolute;mso-position-horizontal-relative:text;mso-position-vertical:absolute;mso-position-vertical-relative:text;mso-width-percent:0;mso-height-percent:0;mso-width-relative:page;mso-height-relative:page;v-text-anchor:top" o:gfxdata="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">
                 <v:stroke dashstyle="1 1" endcap="round"/>
                 <v:textbox>
                   <w:txbxContent>
@@ -10652,7 +10652,7 @@
         <mc:AlternateContent>
           <mc:Choice Requires="wps">
             <w:drawing>
-              <wp:anchor distT="0" distB="0" distL="114300" distR="114300" simplePos="0" relativeHeight="251702784" behindDoc="0" locked="0" layoutInCell="1" allowOverlap="1" wp14:anchorId="155F1680" wp14:editId="7BEEE3A5">
+              <wp:anchor distT="0" distB="0" distL="114300" distR="114300" simplePos="0" relativeHeight="251658333" behindDoc="0" locked="0" layoutInCell="1" allowOverlap="1" wp14:anchorId="155F1680" wp14:editId="7BEEE3A5">
                 <wp:simplePos x="0" y="0"/>
                 <wp:positionH relativeFrom="column">
                   <wp:posOffset>2369902</wp:posOffset>
@@ -10753,7 +10753,7 @@
         <mc:AlternateContent>
           <mc:Choice Requires="wps">
             <w:drawing>
-              <wp:anchor distT="0" distB="0" distL="114300" distR="114300" simplePos="0" relativeHeight="251701760" behindDoc="0" locked="0" layoutInCell="1" allowOverlap="1" wp14:anchorId="16A02528" wp14:editId="18BE3EE2">
+              <wp:anchor distT="0" distB="0" distL="114300" distR="114300" simplePos="0" relativeHeight="251658332" behindDoc="0" locked="0" layoutInCell="1" allowOverlap="1" wp14:anchorId="16A02528" wp14:editId="18BE3EE2">
                 <wp:simplePos x="0" y="0"/>
                 <wp:positionH relativeFrom="column">
                   <wp:posOffset>2403561</wp:posOffset>
@@ -10854,7 +10854,7 @@
         <mc:AlternateContent>
           <mc:Choice Requires="wps">
             <w:drawing>
-              <wp:anchor distT="0" distB="0" distL="114300" distR="114300" simplePos="0" relativeHeight="251700736" behindDoc="0" locked="0" layoutInCell="1" allowOverlap="1" wp14:anchorId="557F254A" wp14:editId="09C662C6">
+              <wp:anchor distT="0" distB="0" distL="114300" distR="114300" simplePos="0" relativeHeight="251658331" behindDoc="0" locked="0" layoutInCell="1" allowOverlap="1" wp14:anchorId="557F254A" wp14:editId="09C662C6">
                 <wp:simplePos x="0" y="0"/>
                 <wp:positionH relativeFrom="column">
                   <wp:posOffset>1971605</wp:posOffset>
@@ -10955,7 +10955,7 @@
         <mc:AlternateContent>
           <mc:Choice Requires="wps">
             <w:drawing>
-              <wp:anchor distT="0" distB="0" distL="114300" distR="114300" simplePos="0" relativeHeight="251698688" behindDoc="0" locked="0" layoutInCell="1" allowOverlap="1" wp14:anchorId="1AC80612" wp14:editId="069DA69A">
+              <wp:anchor distT="0" distB="0" distL="114300" distR="114300" simplePos="0" relativeHeight="251658329" behindDoc="0" locked="0" layoutInCell="1" allowOverlap="1" wp14:anchorId="1AC80612" wp14:editId="069DA69A">
                 <wp:simplePos x="0" y="0"/>
                 <wp:positionH relativeFrom="column">
                   <wp:posOffset>3654425</wp:posOffset>
@@ -11048,7 +11048,7 @@
         <mc:AlternateContent>
           <mc:Choice Requires="wps">
             <w:drawing>
-              <wp:anchor distT="0" distB="0" distL="114300" distR="114300" simplePos="0" relativeHeight="251697664" behindDoc="0" locked="0" layoutInCell="1" allowOverlap="1" wp14:anchorId="690D0F0D" wp14:editId="35074CE6">
+              <wp:anchor distT="0" distB="0" distL="114300" distR="114300" simplePos="0" relativeHeight="251658328" behindDoc="0" locked="0" layoutInCell="1" allowOverlap="1" wp14:anchorId="690D0F0D" wp14:editId="35074CE6">
                 <wp:simplePos x="0" y="0"/>
                 <wp:positionH relativeFrom="column">
                   <wp:posOffset>3654425</wp:posOffset>
@@ -11128,7 +11128,7 @@
         <mc:AlternateContent>
           <mc:Choice Requires="wps">
             <w:drawing>
-              <wp:anchor distT="0" distB="0" distL="114300" distR="114300" simplePos="0" relativeHeight="251696640" behindDoc="0" locked="0" layoutInCell="1" allowOverlap="1" wp14:anchorId="741DF1F6" wp14:editId="3BD8657A">
+              <wp:anchor distT="0" distB="0" distL="114300" distR="114300" simplePos="0" relativeHeight="251658327" behindDoc="0" locked="0" layoutInCell="1" allowOverlap="1" wp14:anchorId="741DF1F6" wp14:editId="3BD8657A">
                 <wp:simplePos x="0" y="0"/>
                 <wp:positionH relativeFrom="column">
                   <wp:posOffset>3654425</wp:posOffset>
@@ -11208,7 +11208,7 @@
         <mc:AlternateContent>
           <mc:Choice Requires="wps">
             <w:drawing>
-              <wp:anchor distT="0" distB="0" distL="114300" distR="114300" simplePos="0" relativeHeight="251695616" behindDoc="0" locked="0" layoutInCell="1" allowOverlap="1" wp14:anchorId="77B9BD94" wp14:editId="2BAAC2D0">
+              <wp:anchor distT="0" distB="0" distL="114300" distR="114300" simplePos="0" relativeHeight="251658326" behindDoc="0" locked="0" layoutInCell="1" allowOverlap="1" wp14:anchorId="77B9BD94" wp14:editId="2BAAC2D0">
                 <wp:simplePos x="0" y="0"/>
                 <wp:positionH relativeFrom="column">
                   <wp:posOffset>3654425</wp:posOffset>
@@ -11288,7 +11288,7 @@
         <mc:AlternateContent>
           <mc:Choice Requires="wps">
             <w:drawing>
-              <wp:anchor distT="0" distB="0" distL="114300" distR="114300" simplePos="0" relativeHeight="251694592" behindDoc="0" locked="0" layoutInCell="1" allowOverlap="1" wp14:anchorId="51007CB4" wp14:editId="1ABCE8C0">
+              <wp:anchor distT="0" distB="0" distL="114300" distR="114300" simplePos="0" relativeHeight="251658325" behindDoc="0" locked="0" layoutInCell="1" allowOverlap="1" wp14:anchorId="51007CB4" wp14:editId="1ABCE8C0">
                 <wp:simplePos x="0" y="0"/>
                 <wp:positionH relativeFrom="column">
                   <wp:posOffset>3654425</wp:posOffset>
@@ -11368,7 +11368,7 @@
         <mc:AlternateContent>
           <mc:Choice Requires="wps">
             <w:drawing>
-              <wp:anchor distT="0" distB="0" distL="114300" distR="114300" simplePos="0" relativeHeight="251693568" behindDoc="0" locked="0" layoutInCell="1" allowOverlap="1" wp14:anchorId="5C39BBAE" wp14:editId="2DE1E950">
+              <wp:anchor distT="0" distB="0" distL="114300" distR="114300" simplePos="0" relativeHeight="251658324" behindDoc="0" locked="0" layoutInCell="1" allowOverlap="1" wp14:anchorId="5C39BBAE" wp14:editId="2DE1E950">
                 <wp:simplePos x="0" y="0"/>
                 <wp:positionH relativeFrom="column">
                   <wp:posOffset>3654425</wp:posOffset>
@@ -11448,7 +11448,7 @@
         <mc:AlternateContent>
           <mc:Choice Requires="wps">
             <w:drawing>
-              <wp:anchor distT="0" distB="0" distL="114300" distR="114300" simplePos="0" relativeHeight="251692544" behindDoc="0" locked="0" layoutInCell="1" allowOverlap="1" wp14:anchorId="4EC07981" wp14:editId="490222BA">
+              <wp:anchor distT="0" distB="0" distL="114300" distR="114300" simplePos="0" relativeHeight="251658323" behindDoc="0" locked="0" layoutInCell="1" allowOverlap="1" wp14:anchorId="4EC07981" wp14:editId="490222BA">
                 <wp:simplePos x="0" y="0"/>
                 <wp:positionH relativeFrom="column">
                   <wp:posOffset>3654425</wp:posOffset>
@@ -11528,7 +11528,7 @@
         <mc:AlternateContent>
           <mc:Choice Requires="wps">
             <w:drawing>
-              <wp:anchor distT="0" distB="0" distL="114300" distR="114300" simplePos="0" relativeHeight="251691520" behindDoc="0" locked="0" layoutInCell="1" allowOverlap="1" wp14:anchorId="71FB23BE" wp14:editId="4A97189F">
+              <wp:anchor distT="0" distB="0" distL="114300" distR="114300" simplePos="0" relativeHeight="251658322" behindDoc="0" locked="0" layoutInCell="1" allowOverlap="1" wp14:anchorId="71FB23BE" wp14:editId="4A97189F">
                 <wp:simplePos x="0" y="0"/>
                 <wp:positionH relativeFrom="column">
                   <wp:posOffset>3654425</wp:posOffset>
@@ -11608,7 +11608,7 @@
         <mc:AlternateContent>
           <mc:Choice Requires="wps">
             <w:drawing>
-              <wp:anchor distT="0" distB="0" distL="114300" distR="114300" simplePos="0" relativeHeight="251690496" behindDoc="0" locked="0" layoutInCell="1" allowOverlap="1" wp14:anchorId="21987B7B" wp14:editId="71C5F0DA">
+              <wp:anchor distT="0" distB="0" distL="114300" distR="114300" simplePos="0" relativeHeight="251658321" behindDoc="0" locked="0" layoutInCell="1" allowOverlap="1" wp14:anchorId="21987B7B" wp14:editId="71C5F0DA">
                 <wp:simplePos x="0" y="0"/>
                 <wp:positionH relativeFrom="column">
                   <wp:posOffset>3654425</wp:posOffset>
@@ -11688,7 +11688,7 @@
         <mc:AlternateContent>
           <mc:Choice Requires="wps">
             <w:drawing>
-              <wp:anchor distT="0" distB="0" distL="114300" distR="114300" simplePos="0" relativeHeight="251689472" behindDoc="0" locked="0" layoutInCell="1" allowOverlap="1" wp14:anchorId="51B5CCDC" wp14:editId="468102E4">
+              <wp:anchor distT="0" distB="0" distL="114300" distR="114300" simplePos="0" relativeHeight="251658320" behindDoc="0" locked="0" layoutInCell="1" allowOverlap="1" wp14:anchorId="51B5CCDC" wp14:editId="468102E4">
                 <wp:simplePos x="0" y="0"/>
                 <wp:positionH relativeFrom="column">
                   <wp:posOffset>3654425</wp:posOffset>
@@ -11768,7 +11768,7 @@
         <mc:AlternateContent>
           <mc:Choice Requires="wps">
             <w:drawing>
-              <wp:anchor distT="0" distB="0" distL="114300" distR="114300" simplePos="0" relativeHeight="251688448" behindDoc="0" locked="0" layoutInCell="1" allowOverlap="1" wp14:anchorId="5E58BF0A" wp14:editId="0DA5D726">
+              <wp:anchor distT="0" distB="0" distL="114300" distR="114300" simplePos="0" relativeHeight="251658319" behindDoc="0" locked="0" layoutInCell="1" allowOverlap="1" wp14:anchorId="5E58BF0A" wp14:editId="0DA5D726">
                 <wp:simplePos x="0" y="0"/>
                 <wp:positionH relativeFrom="column">
                   <wp:posOffset>3654425</wp:posOffset>
@@ -11848,7 +11848,7 @@
         <mc:AlternateContent>
           <mc:Choice Requires="wps">
             <w:drawing>
-              <wp:anchor distT="0" distB="0" distL="114300" distR="114300" simplePos="0" relativeHeight="251687424" behindDoc="0" locked="0" layoutInCell="1" allowOverlap="1" wp14:anchorId="2E3B9197" wp14:editId="3E4D1DF4">
+              <wp:anchor distT="0" distB="0" distL="114300" distR="114300" simplePos="0" relativeHeight="251658318" behindDoc="0" locked="0" layoutInCell="1" allowOverlap="1" wp14:anchorId="2E3B9197" wp14:editId="3E4D1DF4">
                 <wp:simplePos x="0" y="0"/>
                 <wp:positionH relativeFrom="column">
                   <wp:posOffset>3654425</wp:posOffset>
@@ -11928,7 +11928,7 @@
         <mc:AlternateContent>
           <mc:Choice Requires="wps">
             <w:drawing>
-              <wp:anchor distT="0" distB="0" distL="114300" distR="114300" simplePos="0" relativeHeight="251686400" behindDoc="0" locked="0" layoutInCell="1" allowOverlap="1" wp14:anchorId="2F82FA26" wp14:editId="4EC35BD8">
+              <wp:anchor distT="0" distB="0" distL="114300" distR="114300" simplePos="0" relativeHeight="251658317" behindDoc="0" locked="0" layoutInCell="1" allowOverlap="1" wp14:anchorId="2F82FA26" wp14:editId="4EC35BD8">
                 <wp:simplePos x="0" y="0"/>
                 <wp:positionH relativeFrom="column">
                   <wp:posOffset>3654425</wp:posOffset>
@@ -12008,7 +12008,7 @@
         <mc:AlternateContent>
           <mc:Choice Requires="wps">
             <w:drawing>
-              <wp:anchor distT="0" distB="0" distL="114300" distR="114300" simplePos="0" relativeHeight="251685376" behindDoc="0" locked="0" layoutInCell="1" allowOverlap="1" wp14:anchorId="37A757B8" wp14:editId="29DCF70D">
+              <wp:anchor distT="0" distB="0" distL="114300" distR="114300" simplePos="0" relativeHeight="251658316" behindDoc="0" locked="0" layoutInCell="1" allowOverlap="1" wp14:anchorId="37A757B8" wp14:editId="29DCF70D">
                 <wp:simplePos x="0" y="0"/>
                 <wp:positionH relativeFrom="column">
                   <wp:posOffset>3654425</wp:posOffset>
@@ -12088,7 +12088,7 @@
         <mc:AlternateContent>
           <mc:Choice Requires="wps">
             <w:drawing>
-              <wp:anchor distT="0" distB="0" distL="114300" distR="114300" simplePos="0" relativeHeight="251684352" behindDoc="0" locked="0" layoutInCell="1" allowOverlap="1" wp14:anchorId="1CFE72F5" wp14:editId="688CF48C">
+              <wp:anchor distT="0" distB="0" distL="114300" distR="114300" simplePos="0" relativeHeight="251658315" behindDoc="0" locked="0" layoutInCell="1" allowOverlap="1" wp14:anchorId="1CFE72F5" wp14:editId="688CF48C">
                 <wp:simplePos x="0" y="0"/>
                 <wp:positionH relativeFrom="column">
                   <wp:posOffset>3654425</wp:posOffset>
@@ -12168,7 +12168,7 @@
         <mc:AlternateContent>
           <mc:Choice Requires="wps">
             <w:drawing>
-              <wp:anchor distT="0" distB="0" distL="114300" distR="114300" simplePos="0" relativeHeight="251683328" behindDoc="0" locked="0" layoutInCell="1" allowOverlap="1" wp14:anchorId="028E8D02" wp14:editId="31C439A7">
+              <wp:anchor distT="0" distB="0" distL="114300" distR="114300" simplePos="0" relativeHeight="251658314" behindDoc="0" locked="0" layoutInCell="1" allowOverlap="1" wp14:anchorId="028E8D02" wp14:editId="31C439A7">
                 <wp:simplePos x="0" y="0"/>
                 <wp:positionH relativeFrom="column">
                   <wp:posOffset>3654425</wp:posOffset>
@@ -12248,7 +12248,7 @@
         <mc:AlternateContent>
           <mc:Choice Requires="wps">
             <w:drawing>
-              <wp:anchor distT="0" distB="0" distL="114300" distR="114300" simplePos="0" relativeHeight="251682304" behindDoc="0" locked="0" layoutInCell="1" allowOverlap="1" wp14:anchorId="4FE490CA" wp14:editId="0E936D0D">
+              <wp:anchor distT="0" distB="0" distL="114300" distR="114300" simplePos="0" relativeHeight="251658313" behindDoc="0" locked="0" layoutInCell="1" allowOverlap="1" wp14:anchorId="4FE490CA" wp14:editId="0E936D0D">
                 <wp:simplePos x="0" y="0"/>
                 <wp:positionH relativeFrom="column">
                   <wp:posOffset>3654425</wp:posOffset>
@@ -12328,7 +12328,7 @@
         <mc:AlternateContent>
           <mc:Choice Requires="wps">
             <w:drawing>
-              <wp:anchor distT="0" distB="0" distL="114300" distR="114300" simplePos="0" relativeHeight="251681280" behindDoc="0" locked="0" layoutInCell="1" allowOverlap="1" wp14:anchorId="48CB5321" wp14:editId="3B40F6CD">
+              <wp:anchor distT="0" distB="0" distL="114300" distR="114300" simplePos="0" relativeHeight="251658312" behindDoc="0" locked="0" layoutInCell="1" allowOverlap="1" wp14:anchorId="48CB5321" wp14:editId="3B40F6CD">
                 <wp:simplePos x="0" y="0"/>
                 <wp:positionH relativeFrom="column">
                   <wp:posOffset>3654425</wp:posOffset>
@@ -12408,7 +12408,7 @@
         <mc:AlternateContent>
           <mc:Choice Requires="wps">
             <w:drawing>
-              <wp:anchor distT="0" distB="0" distL="114300" distR="114300" simplePos="0" relativeHeight="251680256" behindDoc="0" locked="0" layoutInCell="1" allowOverlap="1" wp14:anchorId="4648D9D5" wp14:editId="73D9A587">
+              <wp:anchor distT="0" distB="0" distL="114300" distR="114300" simplePos="0" relativeHeight="251658311" behindDoc="0" locked="0" layoutInCell="1" allowOverlap="1" wp14:anchorId="4648D9D5" wp14:editId="73D9A587">
                 <wp:simplePos x="0" y="0"/>
                 <wp:positionH relativeFrom="column">
                   <wp:posOffset>3654425</wp:posOffset>
@@ -12488,7 +12488,7 @@
         <mc:AlternateContent>
           <mc:Choice Requires="wps">
             <w:drawing>
-              <wp:anchor distT="0" distB="0" distL="114300" distR="114300" simplePos="0" relativeHeight="251679232" behindDoc="0" locked="0" layoutInCell="1" allowOverlap="1" wp14:anchorId="7FB0347C" wp14:editId="25DA7069">
+              <wp:anchor distT="0" distB="0" distL="114300" distR="114300" simplePos="0" relativeHeight="251658310" behindDoc="0" locked="0" layoutInCell="1" allowOverlap="1" wp14:anchorId="7FB0347C" wp14:editId="25DA7069">
                 <wp:simplePos x="0" y="0"/>
                 <wp:positionH relativeFrom="column">
                   <wp:posOffset>3654425</wp:posOffset>
@@ -12568,7 +12568,7 @@
         <mc:AlternateContent>
           <mc:Choice Requires="wps">
             <w:drawing>
-              <wp:anchor distT="0" distB="0" distL="114300" distR="114300" simplePos="0" relativeHeight="251678208" behindDoc="0" locked="0" layoutInCell="1" allowOverlap="1" wp14:anchorId="48172D42" wp14:editId="3C3010E6">
+              <wp:anchor distT="0" distB="0" distL="114300" distR="114300" simplePos="0" relativeHeight="251658309" behindDoc="0" locked="0" layoutInCell="1" allowOverlap="1" wp14:anchorId="48172D42" wp14:editId="3C3010E6">
                 <wp:simplePos x="0" y="0"/>
                 <wp:positionH relativeFrom="column">
                   <wp:posOffset>3654425</wp:posOffset>
@@ -12648,7 +12648,7 @@
         <mc:AlternateContent>
           <mc:Choice Requires="wps">
             <w:drawing>
-              <wp:anchor distT="0" distB="0" distL="114300" distR="114300" simplePos="0" relativeHeight="251677184" behindDoc="0" locked="0" layoutInCell="1" allowOverlap="1" wp14:anchorId="1B050BD1" wp14:editId="2BA3169C">
+              <wp:anchor distT="0" distB="0" distL="114300" distR="114300" simplePos="0" relativeHeight="251658308" behindDoc="0" locked="0" layoutInCell="1" allowOverlap="1" wp14:anchorId="1B050BD1" wp14:editId="2BA3169C">
                 <wp:simplePos x="0" y="0"/>
                 <wp:positionH relativeFrom="column">
                   <wp:posOffset>3654425</wp:posOffset>
@@ -12728,7 +12728,7 @@
         <mc:AlternateContent>
           <mc:Choice Requires="wps">
             <w:drawing>
-              <wp:anchor distT="0" distB="0" distL="114300" distR="114300" simplePos="0" relativeHeight="251676160" behindDoc="0" locked="0" layoutInCell="1" allowOverlap="1" wp14:anchorId="2AA735AA" wp14:editId="6BC2902C">
+              <wp:anchor distT="0" distB="0" distL="114300" distR="114300" simplePos="0" relativeHeight="251658307" behindDoc="0" locked="0" layoutInCell="1" allowOverlap="1" wp14:anchorId="2AA735AA" wp14:editId="6BC2902C">
                 <wp:simplePos x="0" y="0"/>
                 <wp:positionH relativeFrom="column">
                   <wp:posOffset>3654425</wp:posOffset>
@@ -12808,7 +12808,7 @@
         <mc:AlternateContent>
           <mc:Choice Requires="wps">
             <w:drawing>
-              <wp:anchor distT="0" distB="0" distL="114300" distR="114300" simplePos="0" relativeHeight="251675136" behindDoc="0" locked="0" layoutInCell="1" allowOverlap="1" wp14:anchorId="2221EAE3" wp14:editId="0A3CC688">
+              <wp:anchor distT="0" distB="0" distL="114300" distR="114300" simplePos="0" relativeHeight="251658306" behindDoc="0" locked="0" layoutInCell="1" allowOverlap="1" wp14:anchorId="2221EAE3" wp14:editId="0A3CC688">
                 <wp:simplePos x="0" y="0"/>
                 <wp:positionH relativeFrom="column">
                   <wp:posOffset>3654425</wp:posOffset>
@@ -12888,7 +12888,7 @@
         <mc:AlternateContent>
           <mc:Choice Requires="wps">
             <w:drawing>
-              <wp:anchor distT="0" distB="0" distL="114300" distR="114300" simplePos="0" relativeHeight="251674112" behindDoc="0" locked="0" layoutInCell="1" allowOverlap="1" wp14:anchorId="58990E7F" wp14:editId="02CDF5BB">
+              <wp:anchor distT="0" distB="0" distL="114300" distR="114300" simplePos="0" relativeHeight="251658305" behindDoc="0" locked="0" layoutInCell="1" allowOverlap="1" wp14:anchorId="58990E7F" wp14:editId="02CDF5BB">
                 <wp:simplePos x="0" y="0"/>
                 <wp:positionH relativeFrom="column">
                   <wp:posOffset>3654425</wp:posOffset>
@@ -12968,7 +12968,7 @@
         <mc:AlternateContent>
           <mc:Choice Requires="wps">
             <w:drawing>
-              <wp:anchor distT="0" distB="0" distL="114300" distR="114300" simplePos="0" relativeHeight="251673088" behindDoc="0" locked="0" layoutInCell="1" allowOverlap="1" wp14:anchorId="3258C760" wp14:editId="12E56973">
+              <wp:anchor distT="0" distB="0" distL="114300" distR="114300" simplePos="0" relativeHeight="251658304" behindDoc="0" locked="0" layoutInCell="1" allowOverlap="1" wp14:anchorId="3258C760" wp14:editId="12E56973">
                 <wp:simplePos x="0" y="0"/>
                 <wp:positionH relativeFrom="column">
                   <wp:posOffset>3654425</wp:posOffset>
@@ -13048,7 +13048,7 @@
         <mc:AlternateContent>
           <mc:Choice Requires="wps">
             <w:drawing>
-              <wp:anchor distT="0" distB="0" distL="114300" distR="114300" simplePos="0" relativeHeight="251672064" behindDoc="0" locked="0" layoutInCell="1" allowOverlap="1" wp14:anchorId="060B1468" wp14:editId="721A9306">
+              <wp:anchor distT="0" distB="0" distL="114300" distR="114300" simplePos="0" relativeHeight="251658303" behindDoc="0" locked="0" layoutInCell="1" allowOverlap="1" wp14:anchorId="060B1468" wp14:editId="721A9306">
                 <wp:simplePos x="0" y="0"/>
                 <wp:positionH relativeFrom="column">
                   <wp:posOffset>3654425</wp:posOffset>
@@ -13128,7 +13128,7 @@
         <mc:AlternateContent>
           <mc:Choice Requires="wps">
             <w:drawing>
-              <wp:anchor distT="0" distB="0" distL="114300" distR="114300" simplePos="0" relativeHeight="251671040" behindDoc="0" locked="0" layoutInCell="1" allowOverlap="1" wp14:anchorId="008744B2" wp14:editId="60630959">
+              <wp:anchor distT="0" distB="0" distL="114300" distR="114300" simplePos="0" relativeHeight="251658302" behindDoc="0" locked="0" layoutInCell="1" allowOverlap="1" wp14:anchorId="008744B2" wp14:editId="60630959">
                 <wp:simplePos x="0" y="0"/>
                 <wp:positionH relativeFrom="column">
                   <wp:posOffset>3654425</wp:posOffset>
@@ -13208,7 +13208,7 @@
         <mc:AlternateContent>
           <mc:Choice Requires="wps">
             <w:drawing>
-              <wp:anchor distT="0" distB="0" distL="114300" distR="114300" simplePos="0" relativeHeight="251670016" behindDoc="0" locked="0" layoutInCell="1" allowOverlap="1" wp14:anchorId="526A8D60" wp14:editId="5CBE6C59">
+              <wp:anchor distT="0" distB="0" distL="114300" distR="114300" simplePos="0" relativeHeight="251658301" behindDoc="0" locked="0" layoutInCell="1" allowOverlap="1" wp14:anchorId="526A8D60" wp14:editId="5CBE6C59">
                 <wp:simplePos x="0" y="0"/>
                 <wp:positionH relativeFrom="column">
                   <wp:posOffset>3654425</wp:posOffset>
@@ -13288,7 +13288,7 @@
         <mc:AlternateContent>
           <mc:Choice Requires="wps">
             <w:drawing>
-              <wp:anchor distT="0" distB="0" distL="114300" distR="114300" simplePos="0" relativeHeight="251668992" behindDoc="0" locked="0" layoutInCell="1" allowOverlap="1" wp14:anchorId="104F6F52" wp14:editId="526E6039">
+              <wp:anchor distT="0" distB="0" distL="114300" distR="114300" simplePos="0" relativeHeight="251658300" behindDoc="0" locked="0" layoutInCell="1" allowOverlap="1" wp14:anchorId="104F6F52" wp14:editId="526E6039">
                 <wp:simplePos x="0" y="0"/>
                 <wp:positionH relativeFrom="column">
                   <wp:posOffset>3654425</wp:posOffset>
@@ -13368,7 +13368,7 @@
         <mc:AlternateContent>
           <mc:Choice Requires="wps">
             <w:drawing>
-              <wp:anchor distT="0" distB="0" distL="114300" distR="114300" simplePos="0" relativeHeight="251667968" behindDoc="0" locked="0" layoutInCell="1" allowOverlap="1" wp14:anchorId="6F6E56D3" wp14:editId="7705E0F9">
+              <wp:anchor distT="0" distB="0" distL="114300" distR="114300" simplePos="0" relativeHeight="251658299" behindDoc="0" locked="0" layoutInCell="1" allowOverlap="1" wp14:anchorId="6F6E56D3" wp14:editId="7705E0F9">
                 <wp:simplePos x="0" y="0"/>
                 <wp:positionH relativeFrom="column">
                   <wp:posOffset>3654425</wp:posOffset>
@@ -13448,7 +13448,7 @@
         <mc:AlternateContent>
           <mc:Choice Requires="wps">
             <w:drawing>
-              <wp:anchor distT="0" distB="0" distL="114300" distR="114300" simplePos="0" relativeHeight="251666944" behindDoc="0" locked="0" layoutInCell="1" allowOverlap="1" wp14:anchorId="3794A845" wp14:editId="5D0823A0">
+              <wp:anchor distT="0" distB="0" distL="114300" distR="114300" simplePos="0" relativeHeight="251658298" behindDoc="0" locked="0" layoutInCell="1" allowOverlap="1" wp14:anchorId="3794A845" wp14:editId="5D0823A0">
                 <wp:simplePos x="0" y="0"/>
                 <wp:positionH relativeFrom="column">
                   <wp:posOffset>3654425</wp:posOffset>
@@ -13528,7 +13528,7 @@
         <mc:AlternateContent>
           <mc:Choice Requires="wps">
             <w:drawing>
-              <wp:anchor distT="0" distB="0" distL="114300" distR="114300" simplePos="0" relativeHeight="251665920" behindDoc="0" locked="0" layoutInCell="1" allowOverlap="1" wp14:anchorId="1C4B92AF" wp14:editId="1A470A16">
+              <wp:anchor distT="0" distB="0" distL="114300" distR="114300" simplePos="0" relativeHeight="251658297" behindDoc="0" locked="0" layoutInCell="1" allowOverlap="1" wp14:anchorId="1C4B92AF" wp14:editId="1A470A16">
                 <wp:simplePos x="0" y="0"/>
                 <wp:positionH relativeFrom="column">
                   <wp:posOffset>3654425</wp:posOffset>
@@ -13608,7 +13608,7 @@
         <mc:AlternateContent>
           <mc:Choice Requires="wps">
             <w:drawing>
-              <wp:anchor distT="0" distB="0" distL="114300" distR="114300" simplePos="0" relativeHeight="251664896" behindDoc="0" locked="0" layoutInCell="1" allowOverlap="1" wp14:anchorId="325A9E8C" wp14:editId="59812F4F">
+              <wp:anchor distT="0" distB="0" distL="114300" distR="114300" simplePos="0" relativeHeight="251658296" behindDoc="0" locked="0" layoutInCell="1" allowOverlap="1" wp14:anchorId="325A9E8C" wp14:editId="59812F4F">
                 <wp:simplePos x="0" y="0"/>
                 <wp:positionH relativeFrom="column">
                   <wp:posOffset>3654425</wp:posOffset>
@@ -13688,7 +13688,7 @@
         <mc:AlternateContent>
           <mc:Choice Requires="wps">
             <w:drawing>
-              <wp:anchor distT="0" distB="0" distL="114300" distR="114300" simplePos="0" relativeHeight="251663872" behindDoc="0" locked="0" layoutInCell="1" allowOverlap="1" wp14:anchorId="4C00CA5B" wp14:editId="555FEB09">
+              <wp:anchor distT="0" distB="0" distL="114300" distR="114300" simplePos="0" relativeHeight="251658295" behindDoc="0" locked="0" layoutInCell="1" allowOverlap="1" wp14:anchorId="4C00CA5B" wp14:editId="555FEB09">
                 <wp:simplePos x="0" y="0"/>
                 <wp:positionH relativeFrom="column">
                   <wp:posOffset>3654425</wp:posOffset>
@@ -13768,7 +13768,7 @@
         <mc:AlternateContent>
           <mc:Choice Requires="wps">
             <w:drawing>
-              <wp:anchor distT="0" distB="0" distL="114300" distR="114300" simplePos="0" relativeHeight="251662848" behindDoc="0" locked="0" layoutInCell="1" allowOverlap="1" wp14:anchorId="5BC89A46" wp14:editId="39D35FBF">
+              <wp:anchor distT="0" distB="0" distL="114300" distR="114300" simplePos="0" relativeHeight="251658294" behindDoc="0" locked="0" layoutInCell="1" allowOverlap="1" wp14:anchorId="5BC89A46" wp14:editId="39D35FBF">
                 <wp:simplePos x="0" y="0"/>
                 <wp:positionH relativeFrom="column">
                   <wp:posOffset>3654425</wp:posOffset>
@@ -13848,7 +13848,7 @@
         <mc:AlternateContent>
           <mc:Choice Requires="wps">
             <w:drawing>
-              <wp:anchor distT="0" distB="0" distL="114300" distR="114300" simplePos="0" relativeHeight="251661824" behindDoc="0" locked="0" layoutInCell="1" allowOverlap="1" wp14:anchorId="7D0D06F0" wp14:editId="77D01C3F">
+              <wp:anchor distT="0" distB="0" distL="114300" distR="114300" simplePos="0" relativeHeight="251658293" behindDoc="0" locked="0" layoutInCell="1" allowOverlap="1" wp14:anchorId="7D0D06F0" wp14:editId="77D01C3F">
                 <wp:simplePos x="0" y="0"/>
                 <wp:positionH relativeFrom="column">
                   <wp:posOffset>3654425</wp:posOffset>
@@ -13928,7 +13928,7 @@
         <mc:AlternateContent>
           <mc:Choice Requires="wps">
             <w:drawing>
-              <wp:anchor distT="0" distB="0" distL="114300" distR="114300" simplePos="0" relativeHeight="251660800" behindDoc="0" locked="0" layoutInCell="1" allowOverlap="1" wp14:anchorId="05D88EDB" wp14:editId="5FED25AC">
+              <wp:anchor distT="0" distB="0" distL="114300" distR="114300" simplePos="0" relativeHeight="251658292" behindDoc="0" locked="0" layoutInCell="1" allowOverlap="1" wp14:anchorId="05D88EDB" wp14:editId="5FED25AC">
                 <wp:simplePos x="0" y="0"/>
                 <wp:positionH relativeFrom="column">
                   <wp:posOffset>3654425</wp:posOffset>
@@ -14008,7 +14008,7 @@
         <mc:AlternateContent>
           <mc:Choice Requires="wps">
             <w:drawing>
-              <wp:anchor distT="0" distB="0" distL="114300" distR="114300" simplePos="0" relativeHeight="251659776" behindDoc="0" locked="0" layoutInCell="1" allowOverlap="1" wp14:anchorId="27CB2794" wp14:editId="37BA286A">
+              <wp:anchor distT="0" distB="0" distL="114300" distR="114300" simplePos="0" relativeHeight="251658291" behindDoc="0" locked="0" layoutInCell="1" allowOverlap="1" wp14:anchorId="27CB2794" wp14:editId="37BA286A">
                 <wp:simplePos x="0" y="0"/>
                 <wp:positionH relativeFrom="column">
                   <wp:posOffset>3654425</wp:posOffset>
@@ -14088,7 +14088,7 @@
         <mc:AlternateContent>
           <mc:Choice Requires="wps">
             <w:drawing>
-              <wp:anchor distT="0" distB="0" distL="114300" distR="114300" simplePos="0" relativeHeight="251658752" behindDoc="0" locked="0" layoutInCell="1" allowOverlap="1" wp14:anchorId="7BAD4791" wp14:editId="419F7671">
+              <wp:anchor distT="0" distB="0" distL="114300" distR="114300" simplePos="0" relativeHeight="251658290" behindDoc="0" locked="0" layoutInCell="1" allowOverlap="1" wp14:anchorId="7BAD4791" wp14:editId="419F7671">
                 <wp:simplePos x="0" y="0"/>
                 <wp:positionH relativeFrom="column">
                   <wp:posOffset>3654425</wp:posOffset>
@@ -14168,7 +14168,7 @@
         <mc:AlternateContent>
           <mc:Choice Requires="wps">
             <w:drawing>
-              <wp:anchor distT="0" distB="0" distL="114300" distR="114300" simplePos="0" relativeHeight="251657728" behindDoc="0" locked="0" layoutInCell="1" allowOverlap="1" wp14:anchorId="1D8FB521" wp14:editId="2D2471EE">
+              <wp:anchor distT="0" distB="0" distL="114300" distR="114300" simplePos="0" relativeHeight="251658289" behindDoc="0" locked="0" layoutInCell="1" allowOverlap="1" wp14:anchorId="1D8FB521" wp14:editId="2D2471EE">
                 <wp:simplePos x="0" y="0"/>
                 <wp:positionH relativeFrom="column">
                   <wp:posOffset>3654425</wp:posOffset>
@@ -14248,7 +14248,7 @@
         <mc:AlternateContent>
           <mc:Choice Requires="wps">
             <w:drawing>
-              <wp:anchor distT="0" distB="0" distL="114300" distR="114300" simplePos="0" relativeHeight="251656704" behindDoc="0" locked="0" layoutInCell="1" allowOverlap="1" wp14:anchorId="6A33811D" wp14:editId="54ED2494">
+              <wp:anchor distT="0" distB="0" distL="114300" distR="114300" simplePos="0" relativeHeight="251658288" behindDoc="0" locked="0" layoutInCell="1" allowOverlap="1" wp14:anchorId="6A33811D" wp14:editId="54ED2494">
                 <wp:simplePos x="0" y="0"/>
                 <wp:positionH relativeFrom="column">
                   <wp:posOffset>3654425</wp:posOffset>
@@ -14328,7 +14328,7 @@
         <mc:AlternateContent>
           <mc:Choice Requires="wps">
             <w:drawing>
-              <wp:anchor distT="0" distB="0" distL="114300" distR="114300" simplePos="0" relativeHeight="251655680" behindDoc="0" locked="0" layoutInCell="1" allowOverlap="1" wp14:anchorId="28A122F3" wp14:editId="48C68E4E">
+              <wp:anchor distT="0" distB="0" distL="114300" distR="114300" simplePos="0" relativeHeight="251658287" behindDoc="0" locked="0" layoutInCell="1" allowOverlap="1" wp14:anchorId="28A122F3" wp14:editId="48C68E4E">
                 <wp:simplePos x="0" y="0"/>
                 <wp:positionH relativeFrom="column">
                   <wp:posOffset>3654425</wp:posOffset>
@@ -14408,7 +14408,7 @@
         <mc:AlternateContent>
           <mc:Choice Requires="wps">
             <w:drawing>
-              <wp:anchor distT="0" distB="0" distL="114300" distR="114300" simplePos="0" relativeHeight="251654656" behindDoc="0" locked="0" layoutInCell="1" allowOverlap="1" wp14:anchorId="044E31DD" wp14:editId="46DB9180">
+              <wp:anchor distT="0" distB="0" distL="114300" distR="114300" simplePos="0" relativeHeight="251658286" behindDoc="0" locked="0" layoutInCell="1" allowOverlap="1" wp14:anchorId="044E31DD" wp14:editId="46DB9180">
                 <wp:simplePos x="0" y="0"/>
                 <wp:positionH relativeFrom="column">
                   <wp:posOffset>3654425</wp:posOffset>
@@ -14488,7 +14488,7 @@
         <mc:AlternateContent>
           <mc:Choice Requires="wps">
             <w:drawing>
-              <wp:anchor distT="0" distB="0" distL="114300" distR="114300" simplePos="0" relativeHeight="251653632" behindDoc="0" locked="0" layoutInCell="1" allowOverlap="1" wp14:anchorId="7069A766" wp14:editId="2047F456">
+              <wp:anchor distT="0" distB="0" distL="114300" distR="114300" simplePos="0" relativeHeight="251658285" behindDoc="0" locked="0" layoutInCell="1" allowOverlap="1" wp14:anchorId="7069A766" wp14:editId="2047F456">
                 <wp:simplePos x="0" y="0"/>
                 <wp:positionH relativeFrom="column">
                   <wp:posOffset>3654425</wp:posOffset>
@@ -14568,7 +14568,7 @@
         <mc:AlternateContent>
           <mc:Choice Requires="wps">
             <w:drawing>
-              <wp:anchor distT="0" distB="0" distL="114300" distR="114300" simplePos="0" relativeHeight="251652608" behindDoc="0" locked="0" layoutInCell="1" allowOverlap="1" wp14:anchorId="03753986" wp14:editId="432C7896">
+              <wp:anchor distT="0" distB="0" distL="114300" distR="114300" simplePos="0" relativeHeight="251658284" behindDoc="0" locked="0" layoutInCell="1" allowOverlap="1" wp14:anchorId="03753986" wp14:editId="432C7896">
                 <wp:simplePos x="0" y="0"/>
                 <wp:positionH relativeFrom="column">
                   <wp:posOffset>3654425</wp:posOffset>
@@ -14648,7 +14648,7 @@
         <mc:AlternateContent>
           <mc:Choice Requires="wps">
             <w:drawing>
-              <wp:anchor distT="0" distB="0" distL="114300" distR="114300" simplePos="0" relativeHeight="251651584" behindDoc="0" locked="0" layoutInCell="1" allowOverlap="1" wp14:anchorId="1C1AE118" wp14:editId="4E3A1DF3">
+              <wp:anchor distT="0" distB="0" distL="114300" distR="114300" simplePos="0" relativeHeight="251658283" behindDoc="0" locked="0" layoutInCell="1" allowOverlap="1" wp14:anchorId="1C1AE118" wp14:editId="4E3A1DF3">
                 <wp:simplePos x="0" y="0"/>
                 <wp:positionH relativeFrom="column">
                   <wp:posOffset>3654425</wp:posOffset>
@@ -14728,7 +14728,7 @@
         <mc:AlternateContent>
           <mc:Choice Requires="wps">
             <w:drawing>
-              <wp:anchor distT="0" distB="0" distL="114300" distR="114300" simplePos="0" relativeHeight="251650560" behindDoc="0" locked="0" layoutInCell="1" allowOverlap="1" wp14:anchorId="269BD104" wp14:editId="42AE42D8">
+              <wp:anchor distT="0" distB="0" distL="114300" distR="114300" simplePos="0" relativeHeight="251658282" behindDoc="0" locked="0" layoutInCell="1" allowOverlap="1" wp14:anchorId="269BD104" wp14:editId="42AE42D8">
                 <wp:simplePos x="0" y="0"/>
                 <wp:positionH relativeFrom="column">
                   <wp:posOffset>3654425</wp:posOffset>
@@ -14808,7 +14808,7 @@
         <mc:AlternateContent>
           <mc:Choice Requires="wps">
             <w:drawing>
-              <wp:anchor distT="0" distB="0" distL="114300" distR="114300" simplePos="0" relativeHeight="251649536" behindDoc="0" locked="0" layoutInCell="1" allowOverlap="1" wp14:anchorId="324741BF" wp14:editId="72B1F7BA">
+              <wp:anchor distT="0" distB="0" distL="114300" distR="114300" simplePos="0" relativeHeight="251658281" behindDoc="0" locked="0" layoutInCell="1" allowOverlap="1" wp14:anchorId="324741BF" wp14:editId="72B1F7BA">
                 <wp:simplePos x="0" y="0"/>
                 <wp:positionH relativeFrom="column">
                   <wp:posOffset>3654425</wp:posOffset>
@@ -14888,7 +14888,7 @@
         <mc:AlternateContent>
           <mc:Choice Requires="wps">
             <w:drawing>
-              <wp:anchor distT="0" distB="0" distL="114300" distR="114300" simplePos="0" relativeHeight="251648512" behindDoc="0" locked="0" layoutInCell="1" allowOverlap="1" wp14:anchorId="30799561" wp14:editId="436478FD">
+              <wp:anchor distT="0" distB="0" distL="114300" distR="114300" simplePos="0" relativeHeight="251658280" behindDoc="0" locked="0" layoutInCell="1" allowOverlap="1" wp14:anchorId="30799561" wp14:editId="436478FD">
                 <wp:simplePos x="0" y="0"/>
                 <wp:positionH relativeFrom="column">
                   <wp:posOffset>3654425</wp:posOffset>
@@ -14968,7 +14968,7 @@
         <mc:AlternateContent>
           <mc:Choice Requires="wps">
             <w:drawing>
-              <wp:anchor distT="0" distB="0" distL="114300" distR="114300" simplePos="0" relativeHeight="251647488" behindDoc="0" locked="0" layoutInCell="1" allowOverlap="1" wp14:anchorId="00825815" wp14:editId="2379CCC3">
+              <wp:anchor distT="0" distB="0" distL="114300" distR="114300" simplePos="0" relativeHeight="251658279" behindDoc="0" locked="0" layoutInCell="1" allowOverlap="1" wp14:anchorId="00825815" wp14:editId="2379CCC3">
                 <wp:simplePos x="0" y="0"/>
                 <wp:positionH relativeFrom="column">
                   <wp:posOffset>3654425</wp:posOffset>
@@ -15048,7 +15048,7 @@
         <mc:AlternateContent>
           <mc:Choice Requires="wps">
             <w:drawing>
-              <wp:anchor distT="0" distB="0" distL="114300" distR="114300" simplePos="0" relativeHeight="251646464" behindDoc="0" locked="0" layoutInCell="1" allowOverlap="1" wp14:anchorId="12B111FC" wp14:editId="2E0BB7EB">
+              <wp:anchor distT="0" distB="0" distL="114300" distR="114300" simplePos="0" relativeHeight="251658278" behindDoc="0" locked="0" layoutInCell="1" allowOverlap="1" wp14:anchorId="12B111FC" wp14:editId="2E0BB7EB">
                 <wp:simplePos x="0" y="0"/>
                 <wp:positionH relativeFrom="column">
                   <wp:posOffset>3654425</wp:posOffset>
@@ -15128,7 +15128,7 @@
         <mc:AlternateContent>
           <mc:Choice Requires="wps">
             <w:drawing>
-              <wp:anchor distT="0" distB="0" distL="114300" distR="114300" simplePos="0" relativeHeight="251645440" behindDoc="0" locked="0" layoutInCell="1" allowOverlap="1" wp14:anchorId="129B7985" wp14:editId="7191958E">
+              <wp:anchor distT="0" distB="0" distL="114300" distR="114300" simplePos="0" relativeHeight="251658277" behindDoc="0" locked="0" layoutInCell="1" allowOverlap="1" wp14:anchorId="129B7985" wp14:editId="7191958E">
                 <wp:simplePos x="0" y="0"/>
                 <wp:positionH relativeFrom="column">
                   <wp:posOffset>3654425</wp:posOffset>
@@ -15208,7 +15208,7 @@
         <mc:AlternateContent>
           <mc:Choice Requires="wps">
             <w:drawing>
-              <wp:anchor distT="0" distB="0" distL="114300" distR="114300" simplePos="0" relativeHeight="251644416" behindDoc="0" locked="0" layoutInCell="1" allowOverlap="1" wp14:anchorId="79234D8C" wp14:editId="5A62FE1A">
+              <wp:anchor distT="0" distB="0" distL="114300" distR="114300" simplePos="0" relativeHeight="251658276" behindDoc="0" locked="0" layoutInCell="1" allowOverlap="1" wp14:anchorId="79234D8C" wp14:editId="5A62FE1A">
                 <wp:simplePos x="0" y="0"/>
                 <wp:positionH relativeFrom="column">
                   <wp:posOffset>3654425</wp:posOffset>
@@ -15288,7 +15288,7 @@
         <mc:AlternateContent>
           <mc:Choice Requires="wps">
             <w:drawing>
-              <wp:anchor distT="0" distB="0" distL="114300" distR="114300" simplePos="0" relativeHeight="251643392" behindDoc="0" locked="0" layoutInCell="1" allowOverlap="1" wp14:anchorId="22BB0A3B" wp14:editId="7C844AA7">
+              <wp:anchor distT="0" distB="0" distL="114300" distR="114300" simplePos="0" relativeHeight="251658275" behindDoc="0" locked="0" layoutInCell="1" allowOverlap="1" wp14:anchorId="22BB0A3B" wp14:editId="7C844AA7">
                 <wp:simplePos x="0" y="0"/>
                 <wp:positionH relativeFrom="column">
                   <wp:posOffset>3654425</wp:posOffset>
@@ -15368,7 +15368,7 @@
         <mc:AlternateContent>
           <mc:Choice Requires="wps">
             <w:drawing>
-              <wp:anchor distT="0" distB="0" distL="114300" distR="114300" simplePos="0" relativeHeight="251642368" behindDoc="0" locked="0" layoutInCell="1" allowOverlap="1" wp14:anchorId="7A30E4F9" wp14:editId="40CD0B7C">
+              <wp:anchor distT="0" distB="0" distL="114300" distR="114300" simplePos="0" relativeHeight="251658274" behindDoc="0" locked="0" layoutInCell="1" allowOverlap="1" wp14:anchorId="7A30E4F9" wp14:editId="40CD0B7C">
                 <wp:simplePos x="0" y="0"/>
                 <wp:positionH relativeFrom="column">
                   <wp:posOffset>3654425</wp:posOffset>
@@ -15448,7 +15448,7 @@
         <mc:AlternateContent>
           <mc:Choice Requires="wps">
             <w:drawing>
-              <wp:anchor distT="0" distB="0" distL="114300" distR="114300" simplePos="0" relativeHeight="251641344" behindDoc="0" locked="0" layoutInCell="1" allowOverlap="1" wp14:anchorId="153E6499" wp14:editId="15A5FF2D">
+              <wp:anchor distT="0" distB="0" distL="114300" distR="114300" simplePos="0" relativeHeight="251658273" behindDoc="0" locked="0" layoutInCell="1" allowOverlap="1" wp14:anchorId="153E6499" wp14:editId="15A5FF2D">
                 <wp:simplePos x="0" y="0"/>
                 <wp:positionH relativeFrom="column">
                   <wp:posOffset>3654425</wp:posOffset>
@@ -15528,7 +15528,7 @@
         <mc:AlternateContent>
           <mc:Choice Requires="wps">
             <w:drawing>
-              <wp:anchor distT="0" distB="0" distL="114300" distR="114300" simplePos="0" relativeHeight="251640320" behindDoc="0" locked="0" layoutInCell="1" allowOverlap="1" wp14:anchorId="1C3B20AA" wp14:editId="2360DFE5">
+              <wp:anchor distT="0" distB="0" distL="114300" distR="114300" simplePos="0" relativeHeight="251658272" behindDoc="0" locked="0" layoutInCell="1" allowOverlap="1" wp14:anchorId="1C3B20AA" wp14:editId="2360DFE5">
                 <wp:simplePos x="0" y="0"/>
                 <wp:positionH relativeFrom="column">
                   <wp:posOffset>3654425</wp:posOffset>
@@ -15608,7 +15608,7 @@
         <mc:AlternateContent>
           <mc:Choice Requires="wps">
             <w:drawing>
-              <wp:anchor distT="0" distB="0" distL="114300" distR="114300" simplePos="0" relativeHeight="251639296" behindDoc="0" locked="0" layoutInCell="1" allowOverlap="1" wp14:anchorId="567A0844" wp14:editId="229BFBC3">
+              <wp:anchor distT="0" distB="0" distL="114300" distR="114300" simplePos="0" relativeHeight="251658271" behindDoc="0" locked="0" layoutInCell="1" allowOverlap="1" wp14:anchorId="567A0844" wp14:editId="229BFBC3">
                 <wp:simplePos x="0" y="0"/>
                 <wp:positionH relativeFrom="column">
                   <wp:posOffset>3654425</wp:posOffset>
@@ -15688,7 +15688,7 @@
         <mc:AlternateContent>
           <mc:Choice Requires="wps">
             <w:drawing>
-              <wp:anchor distT="0" distB="0" distL="114300" distR="114300" simplePos="0" relativeHeight="251638272" behindDoc="0" locked="0" layoutInCell="1" allowOverlap="1" wp14:anchorId="55162043" wp14:editId="4CE07B90">
+              <wp:anchor distT="0" distB="0" distL="114300" distR="114300" simplePos="0" relativeHeight="251658270" behindDoc="0" locked="0" layoutInCell="1" allowOverlap="1" wp14:anchorId="55162043" wp14:editId="4CE07B90">
                 <wp:simplePos x="0" y="0"/>
                 <wp:positionH relativeFrom="column">
                   <wp:posOffset>3654425</wp:posOffset>
@@ -15768,7 +15768,7 @@
         <mc:AlternateContent>
           <mc:Choice Requires="wps">
             <w:drawing>
-              <wp:anchor distT="0" distB="0" distL="114300" distR="114300" simplePos="0" relativeHeight="251637248" behindDoc="0" locked="0" layoutInCell="1" allowOverlap="1" wp14:anchorId="5AF11941" wp14:editId="6E62B990">
+              <wp:anchor distT="0" distB="0" distL="114300" distR="114300" simplePos="0" relativeHeight="251658269" behindDoc="0" locked="0" layoutInCell="1" allowOverlap="1" wp14:anchorId="5AF11941" wp14:editId="6E62B990">
                 <wp:simplePos x="0" y="0"/>
                 <wp:positionH relativeFrom="column">
                   <wp:posOffset>3654425</wp:posOffset>
@@ -15848,7 +15848,7 @@
         <mc:AlternateContent>
           <mc:Choice Requires="wps">
             <w:drawing>
-              <wp:anchor distT="0" distB="0" distL="114300" distR="114300" simplePos="0" relativeHeight="251636224" behindDoc="0" locked="0" layoutInCell="1" allowOverlap="1" wp14:anchorId="5C75B92E" wp14:editId="2B4DFAE5">
+              <wp:anchor distT="0" distB="0" distL="114300" distR="114300" simplePos="0" relativeHeight="251658268" behindDoc="0" locked="0" layoutInCell="1" allowOverlap="1" wp14:anchorId="5C75B92E" wp14:editId="2B4DFAE5">
                 <wp:simplePos x="0" y="0"/>
                 <wp:positionH relativeFrom="column">
                   <wp:posOffset>3654425</wp:posOffset>
@@ -15928,7 +15928,7 @@
         <mc:AlternateContent>
           <mc:Choice Requires="wps">
             <w:drawing>
-              <wp:anchor distT="0" distB="0" distL="114300" distR="114300" simplePos="0" relativeHeight="251635200" behindDoc="0" locked="0" layoutInCell="1" allowOverlap="1" wp14:anchorId="699EED38" wp14:editId="10FF68DE">
+              <wp:anchor distT="0" distB="0" distL="114300" distR="114300" simplePos="0" relativeHeight="251658267" behindDoc="0" locked="0" layoutInCell="1" allowOverlap="1" wp14:anchorId="699EED38" wp14:editId="10FF68DE">
                 <wp:simplePos x="0" y="0"/>
                 <wp:positionH relativeFrom="column">
                   <wp:posOffset>3654425</wp:posOffset>
@@ -16008,7 +16008,7 @@
         <mc:AlternateContent>
           <mc:Choice Requires="wps">
             <w:drawing>
-              <wp:anchor distT="0" distB="0" distL="114300" distR="114300" simplePos="0" relativeHeight="251634176" behindDoc="0" locked="0" layoutInCell="1" allowOverlap="1" wp14:anchorId="3166D93A" wp14:editId="51A851F9">
+              <wp:anchor distT="0" distB="0" distL="114300" distR="114300" simplePos="0" relativeHeight="251658266" behindDoc="0" locked="0" layoutInCell="1" allowOverlap="1" wp14:anchorId="3166D93A" wp14:editId="51A851F9">
                 <wp:simplePos x="0" y="0"/>
                 <wp:positionH relativeFrom="column">
                   <wp:posOffset>3654425</wp:posOffset>
@@ -16088,7 +16088,7 @@
         <mc:AlternateContent>
           <mc:Choice Requires="wps">
             <w:drawing>
-              <wp:anchor distT="0" distB="0" distL="114300" distR="114300" simplePos="0" relativeHeight="251633152" behindDoc="0" locked="0" layoutInCell="1" allowOverlap="1" wp14:anchorId="415D975F" wp14:editId="3E84F027">
+              <wp:anchor distT="0" distB="0" distL="114300" distR="114300" simplePos="0" relativeHeight="251658265" behindDoc="0" locked="0" layoutInCell="1" allowOverlap="1" wp14:anchorId="415D975F" wp14:editId="3E84F027">
                 <wp:simplePos x="0" y="0"/>
                 <wp:positionH relativeFrom="column">
                   <wp:posOffset>3654425</wp:posOffset>
@@ -16168,7 +16168,7 @@
         <mc:AlternateContent>
           <mc:Choice Requires="wps">
             <w:drawing>
-              <wp:anchor distT="0" distB="0" distL="114300" distR="114300" simplePos="0" relativeHeight="251632128" behindDoc="0" locked="0" layoutInCell="1" allowOverlap="1" wp14:anchorId="0CFDDD71" wp14:editId="0224E04B">
+              <wp:anchor distT="0" distB="0" distL="114300" distR="114300" simplePos="0" relativeHeight="251658264" behindDoc="0" locked="0" layoutInCell="1" allowOverlap="1" wp14:anchorId="0CFDDD71" wp14:editId="0224E04B">
                 <wp:simplePos x="0" y="0"/>
                 <wp:positionH relativeFrom="column">
                   <wp:posOffset>3654425</wp:posOffset>
@@ -16248,7 +16248,7 @@
         <mc:AlternateContent>
           <mc:Choice Requires="wps">
             <w:drawing>
-              <wp:anchor distT="0" distB="0" distL="114300" distR="114300" simplePos="0" relativeHeight="251631104" behindDoc="0" locked="0" layoutInCell="1" allowOverlap="1" wp14:anchorId="5BBD3F1D" wp14:editId="062B1947">
+              <wp:anchor distT="0" distB="0" distL="114300" distR="114300" simplePos="0" relativeHeight="251658263" behindDoc="0" locked="0" layoutInCell="1" allowOverlap="1" wp14:anchorId="5BBD3F1D" wp14:editId="062B1947">
                 <wp:simplePos x="0" y="0"/>
                 <wp:positionH relativeFrom="column">
                   <wp:posOffset>3654425</wp:posOffset>
@@ -16328,7 +16328,7 @@
         <mc:AlternateContent>
           <mc:Choice Requires="wps">
             <w:drawing>
-              <wp:anchor distT="0" distB="0" distL="114300" distR="114300" simplePos="0" relativeHeight="251630080" behindDoc="0" locked="0" layoutInCell="1" allowOverlap="1" wp14:anchorId="3E7565D3" wp14:editId="38D02FDC">
+              <wp:anchor distT="0" distB="0" distL="114300" distR="114300" simplePos="0" relativeHeight="251658262" behindDoc="0" locked="0" layoutInCell="1" allowOverlap="1" wp14:anchorId="3E7565D3" wp14:editId="38D02FDC">
                 <wp:simplePos x="0" y="0"/>
                 <wp:positionH relativeFrom="column">
                   <wp:posOffset>3654425</wp:posOffset>
@@ -16408,7 +16408,7 @@
         <mc:AlternateContent>
           <mc:Choice Requires="wps">
             <w:drawing>
-              <wp:anchor distT="0" distB="0" distL="114300" distR="114300" simplePos="0" relativeHeight="251629056" behindDoc="0" locked="0" layoutInCell="1" allowOverlap="1" wp14:anchorId="25C8ED74" wp14:editId="284A4F83">
+              <wp:anchor distT="0" distB="0" distL="114300" distR="114300" simplePos="0" relativeHeight="251658261" behindDoc="0" locked="0" layoutInCell="1" allowOverlap="1" wp14:anchorId="25C8ED74" wp14:editId="284A4F83">
                 <wp:simplePos x="0" y="0"/>
                 <wp:positionH relativeFrom="column">
                   <wp:posOffset>3654425</wp:posOffset>
@@ -16488,7 +16488,7 @@
         <mc:AlternateContent>
           <mc:Choice Requires="wps">
             <w:drawing>
-              <wp:anchor distT="0" distB="0" distL="114300" distR="114300" simplePos="0" relativeHeight="251628032" behindDoc="0" locked="0" layoutInCell="1" allowOverlap="1" wp14:anchorId="45D91C4C" wp14:editId="351F62EE">
+              <wp:anchor distT="0" distB="0" distL="114300" distR="114300" simplePos="0" relativeHeight="251658260" behindDoc="0" locked="0" layoutInCell="1" allowOverlap="1" wp14:anchorId="45D91C4C" wp14:editId="351F62EE">
                 <wp:simplePos x="0" y="0"/>
                 <wp:positionH relativeFrom="column">
                   <wp:posOffset>3654425</wp:posOffset>
@@ -16568,7 +16568,7 @@
         <mc:AlternateContent>
           <mc:Choice Requires="wps">
             <w:drawing>
-              <wp:anchor distT="0" distB="0" distL="114300" distR="114300" simplePos="0" relativeHeight="251627008" behindDoc="0" locked="0" layoutInCell="1" allowOverlap="1" wp14:anchorId="10231DB4" wp14:editId="2E3742AE">
+              <wp:anchor distT="0" distB="0" distL="114300" distR="114300" simplePos="0" relativeHeight="251658259" behindDoc="0" locked="0" layoutInCell="1" allowOverlap="1" wp14:anchorId="10231DB4" wp14:editId="2E3742AE">
                 <wp:simplePos x="0" y="0"/>
                 <wp:positionH relativeFrom="column">
                   <wp:posOffset>3654425</wp:posOffset>
@@ -16648,7 +16648,7 @@
         <mc:AlternateContent>
           <mc:Choice Requires="wps">
             <w:drawing>
-              <wp:anchor distT="0" distB="0" distL="114300" distR="114300" simplePos="0" relativeHeight="251625984" behindDoc="0" locked="0" layoutInCell="1" allowOverlap="1" wp14:anchorId="1905E135" wp14:editId="119D797C">
+              <wp:anchor distT="0" distB="0" distL="114300" distR="114300" simplePos="0" relativeHeight="251658258" behindDoc="0" locked="0" layoutInCell="1" allowOverlap="1" wp14:anchorId="1905E135" wp14:editId="119D797C">
                 <wp:simplePos x="0" y="0"/>
                 <wp:positionH relativeFrom="column">
                   <wp:posOffset>3654425</wp:posOffset>
@@ -16728,7 +16728,7 @@
         <mc:AlternateContent>
           <mc:Choice Requires="wps">
             <w:drawing>
-              <wp:anchor distT="0" distB="0" distL="114300" distR="114300" simplePos="0" relativeHeight="251624960" behindDoc="0" locked="0" layoutInCell="1" allowOverlap="1" wp14:anchorId="614A4B9C" wp14:editId="7A437709">
+              <wp:anchor distT="0" distB="0" distL="114300" distR="114300" simplePos="0" relativeHeight="251658257" behindDoc="0" locked="0" layoutInCell="1" allowOverlap="1" wp14:anchorId="614A4B9C" wp14:editId="7A437709">
                 <wp:simplePos x="0" y="0"/>
                 <wp:positionH relativeFrom="column">
                   <wp:posOffset>3654425</wp:posOffset>
@@ -16808,7 +16808,7 @@
         <mc:AlternateContent>
           <mc:Choice Requires="wps">
             <w:drawing>
-              <wp:anchor distT="0" distB="0" distL="114300" distR="114300" simplePos="0" relativeHeight="251623936" behindDoc="0" locked="0" layoutInCell="1" allowOverlap="1" wp14:anchorId="093A8C88" wp14:editId="262E056A">
+              <wp:anchor distT="0" distB="0" distL="114300" distR="114300" simplePos="0" relativeHeight="251658256" behindDoc="0" locked="0" layoutInCell="1" allowOverlap="1" wp14:anchorId="093A8C88" wp14:editId="262E056A">
                 <wp:simplePos x="0" y="0"/>
                 <wp:positionH relativeFrom="column">
                   <wp:posOffset>3654425</wp:posOffset>
@@ -16888,7 +16888,7 @@
         <mc:AlternateContent>
           <mc:Choice Requires="wps">
             <w:drawing>
-              <wp:anchor distT="0" distB="0" distL="114300" distR="114300" simplePos="0" relativeHeight="251612672" behindDoc="0" locked="0" layoutInCell="1" allowOverlap="1" wp14:anchorId="4E927C56" wp14:editId="64B8DE5C">
+              <wp:anchor distT="0" distB="0" distL="114300" distR="114300" simplePos="0" relativeHeight="251658245" behindDoc="0" locked="0" layoutInCell="1" allowOverlap="1" wp14:anchorId="4E927C56" wp14:editId="64B8DE5C">
                 <wp:simplePos x="0" y="0"/>
                 <wp:positionH relativeFrom="column">
                   <wp:posOffset>3654425</wp:posOffset>
@@ -16968,7 +16968,7 @@
         <mc:AlternateContent>
           <mc:Choice Requires="wps">
             <w:drawing>
-              <wp:anchor distT="0" distB="0" distL="114300" distR="114300" simplePos="0" relativeHeight="251622912" behindDoc="0" locked="0" layoutInCell="1" allowOverlap="1" wp14:anchorId="23375793" wp14:editId="1D276850">
+              <wp:anchor distT="0" distB="0" distL="114300" distR="114300" simplePos="0" relativeHeight="251658255" behindDoc="0" locked="0" layoutInCell="1" allowOverlap="1" wp14:anchorId="23375793" wp14:editId="1D276850">
                 <wp:simplePos x="0" y="0"/>
                 <wp:positionH relativeFrom="column">
                   <wp:posOffset>3654425</wp:posOffset>
@@ -17048,7 +17048,7 @@
         <mc:AlternateContent>
           <mc:Choice Requires="wps">
             <w:drawing>
-              <wp:anchor distT="0" distB="0" distL="114300" distR="114300" simplePos="0" relativeHeight="251621888" behindDoc="0" locked="0" layoutInCell="1" allowOverlap="1" wp14:anchorId="0BD98A99" wp14:editId="33A6D8A3">
+              <wp:anchor distT="0" distB="0" distL="114300" distR="114300" simplePos="0" relativeHeight="251658254" behindDoc="0" locked="0" layoutInCell="1" allowOverlap="1" wp14:anchorId="0BD98A99" wp14:editId="33A6D8A3">
                 <wp:simplePos x="0" y="0"/>
                 <wp:positionH relativeFrom="column">
                   <wp:posOffset>3654425</wp:posOffset>
@@ -17128,7 +17128,7 @@
         <mc:AlternateContent>
           <mc:Choice Requires="wps">
             <w:drawing>
-              <wp:anchor distT="0" distB="0" distL="114300" distR="114300" simplePos="0" relativeHeight="251620864" behindDoc="0" locked="0" layoutInCell="1" allowOverlap="1" wp14:anchorId="22D1C2E1" wp14:editId="642DE729">
+              <wp:anchor distT="0" distB="0" distL="114300" distR="114300" simplePos="0" relativeHeight="251658253" behindDoc="0" locked="0" layoutInCell="1" allowOverlap="1" wp14:anchorId="22D1C2E1" wp14:editId="642DE729">
                 <wp:simplePos x="0" y="0"/>
                 <wp:positionH relativeFrom="column">
                   <wp:posOffset>3654425</wp:posOffset>
@@ -17208,7 +17208,7 @@
         <mc:AlternateContent>
           <mc:Choice Requires="wps">
             <w:drawing>
-              <wp:anchor distT="0" distB="0" distL="114300" distR="114300" simplePos="0" relativeHeight="251619840" behindDoc="0" locked="0" layoutInCell="1" allowOverlap="1" wp14:anchorId="5009FD4A" wp14:editId="2A46E137">
+              <wp:anchor distT="0" distB="0" distL="114300" distR="114300" simplePos="0" relativeHeight="251658252" behindDoc="0" locked="0" layoutInCell="1" allowOverlap="1" wp14:anchorId="5009FD4A" wp14:editId="2A46E137">
                 <wp:simplePos x="0" y="0"/>
                 <wp:positionH relativeFrom="column">
                   <wp:posOffset>3654425</wp:posOffset>
@@ -17288,7 +17288,7 @@
         <mc:AlternateContent>
           <mc:Choice Requires="wps">
             <w:drawing>
-              <wp:anchor distT="0" distB="0" distL="114300" distR="114300" simplePos="0" relativeHeight="251699712" behindDoc="0" locked="0" layoutInCell="1" allowOverlap="1" wp14:anchorId="7C3AD2F1" wp14:editId="77BB7131">
+              <wp:anchor distT="0" distB="0" distL="114300" distR="114300" simplePos="0" relativeHeight="251658330" behindDoc="0" locked="0" layoutInCell="1" allowOverlap="1" wp14:anchorId="7C3AD2F1" wp14:editId="77BB7131">
                 <wp:simplePos x="0" y="0"/>
                 <wp:positionH relativeFrom="column">
                   <wp:posOffset>6183630</wp:posOffset>
@@ -17444,7 +17444,7 @@
         <mc:AlternateContent>
           <mc:Choice Requires="wps">
             <w:drawing>
-              <wp:anchor distT="0" distB="0" distL="114300" distR="114300" simplePos="0" relativeHeight="251707904" behindDoc="0" locked="0" layoutInCell="1" allowOverlap="1" wp14:anchorId="6EC872A3" wp14:editId="1AE2BFD1">
+              <wp:anchor distT="0" distB="0" distL="114300" distR="114300" simplePos="0" relativeHeight="251658338" behindDoc="0" locked="0" layoutInCell="1" allowOverlap="1" wp14:anchorId="6EC872A3" wp14:editId="1AE2BFD1">
                 <wp:simplePos x="0" y="0"/>
                 <wp:positionH relativeFrom="column">
                   <wp:posOffset>4138084</wp:posOffset>
@@ -17519,7 +17519,7 @@
                 <v:stroke joinstyle="miter"/>
                 <v:path gradientshapeok="t" o:connecttype="rect"/>
               </v:shapetype>
-              <v:shape id="Cuadro de texto 14" o:spid="_x0000_s1027" type="#_x0000_t202" style="position:absolute;left:0;text-align:left;margin-left:325.85pt;margin-top:76.05pt;width:138pt;height:26.65pt;z-index:251707904;visibility:visible;mso-wrap-style:square;mso-width-percent:0;mso-height-percent:0;mso-wrap-distance-left:9pt;mso-wrap-distance-top:0;mso-wrap-distance-right:9pt;mso-wrap-distance-bottom:0;mso-position-horizontal:absolute;mso-position-horizontal-relative:text;mso-position-vertical:absolute;mso-position-vertical-relative:text;mso-width-percent:0;mso-height-percent:0;mso-width-relative:margin;mso-height-relative:margin;v-text-anchor:top" o:gfxdata="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" fillcolor="white [3201]" stroked="f" strokeweight=".5pt">
+              <v:shape id="Cuadro de texto 14" o:spid="_x0000_s1027" type="#_x0000_t202" style="position:absolute;left:0;text-align:left;margin-left:325.85pt;margin-top:76.05pt;width:138pt;height:26.65pt;z-index:251658338;visibility:visible;mso-wrap-style:square;mso-width-percent:0;mso-height-percent:0;mso-wrap-distance-left:9pt;mso-wrap-distance-top:0;mso-wrap-distance-right:9pt;mso-wrap-distance-bottom:0;mso-position-horizontal:absolute;mso-position-horizontal-relative:text;mso-position-vertical:absolute;mso-position-vertical-relative:text;mso-width-percent:0;mso-height-percent:0;mso-width-relative:margin;mso-height-relative:margin;v-text-anchor:top" o:gfxdata="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" fillcolor="white [3201]" stroked="f" strokeweight=".5pt">
                 <v:textbox>
                   <w:txbxContent>
                     <w:p>
@@ -17555,7 +17555,7 @@
         <mc:AlternateContent>
           <mc:Choice Requires="wps">
             <w:drawing>
-              <wp:anchor distT="0" distB="0" distL="114300" distR="114300" simplePos="0" relativeHeight="251704832" behindDoc="0" locked="0" layoutInCell="1" allowOverlap="1" wp14:anchorId="527A5AEF" wp14:editId="07777777">
+              <wp:anchor distT="0" distB="0" distL="114300" distR="114300" simplePos="0" relativeHeight="251658335" behindDoc="0" locked="0" layoutInCell="1" allowOverlap="1" wp14:anchorId="527A5AEF" wp14:editId="07777777">
                 <wp:simplePos x="0" y="0"/>
                 <wp:positionH relativeFrom="column">
                   <wp:posOffset>3707553</wp:posOffset>
@@ -17798,7 +17798,7 @@
         <mc:AlternateContent>
           <mc:Choice Requires="wps">
             <w:drawing>
-              <wp:anchor distT="0" distB="0" distL="114300" distR="114300" simplePos="0" relativeHeight="251708928" behindDoc="0" locked="0" layoutInCell="1" allowOverlap="1" wp14:anchorId="570F910A" wp14:editId="0B3C1769">
+              <wp:anchor distT="0" distB="0" distL="114300" distR="114300" simplePos="0" relativeHeight="251658339" behindDoc="0" locked="0" layoutInCell="1" allowOverlap="1" wp14:anchorId="570F910A" wp14:editId="0B3C1769">
                 <wp:simplePos x="0" y="0"/>
                 <wp:positionH relativeFrom="column">
                   <wp:posOffset>2450465</wp:posOffset>
@@ -17869,7 +17869,7 @@
           </mc:Choice>
           <mc:Fallback>
             <w:pict>
-              <v:shape w14:anchorId="570F910A" id="Cuadro de texto 16" o:spid="_x0000_s1028" type="#_x0000_t202" style="position:absolute;left:0;text-align:left;margin-left:192.95pt;margin-top:75.35pt;width:95.35pt;height:26.65pt;z-index:251708928;visibility:visible;mso-wrap-style:square;mso-width-percent:0;mso-height-percent:0;mso-wrap-distance-left:9pt;mso-wrap-distance-top:0;mso-wrap-distance-right:9pt;mso-wrap-distance-bottom:0;mso-position-horizontal:absolute;mso-position-horizontal-relative:text;mso-position-vertical:absolute;mso-position-vertical-relative:text;mso-width-percent:0;mso-height-percent:0;mso-width-relative:margin;mso-height-relative:margin;v-text-anchor:top" o:gfxdata="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" fillcolor="white [3201]" stroked="f" strokeweight=".5pt">
+              <v:shape w14:anchorId="570F910A" id="Cuadro de texto 16" o:spid="_x0000_s1028" type="#_x0000_t202" style="position:absolute;left:0;text-align:left;margin-left:192.95pt;margin-top:75.35pt;width:95.35pt;height:26.65pt;z-index:251658339;visibility:visible;mso-wrap-style:square;mso-width-percent:0;mso-height-percent:0;mso-wrap-distance-left:9pt;mso-wrap-distance-top:0;mso-wrap-distance-right:9pt;mso-wrap-distance-bottom:0;mso-position-horizontal:absolute;mso-position-horizontal-relative:text;mso-position-vertical:absolute;mso-position-vertical-relative:text;mso-width-percent:0;mso-height-percent:0;mso-width-relative:margin;mso-height-relative:margin;v-text-anchor:top" o:gfxdata="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" fillcolor="white [3201]" stroked="f" strokeweight=".5pt">
                 <v:textbox>
                   <w:txbxContent>
                     <w:p>
@@ -17905,7 +17905,7 @@
         <mc:AlternateContent>
           <mc:Choice Requires="wps">
             <w:drawing>
-              <wp:anchor distT="0" distB="0" distL="114300" distR="114300" simplePos="0" relativeHeight="251706880" behindDoc="0" locked="0" layoutInCell="1" allowOverlap="1" wp14:anchorId="75DCE107" wp14:editId="07777777">
+              <wp:anchor distT="0" distB="0" distL="114300" distR="114300" simplePos="0" relativeHeight="251658337" behindDoc="0" locked="0" layoutInCell="1" allowOverlap="1" wp14:anchorId="75DCE107" wp14:editId="07777777">
                 <wp:simplePos x="0" y="0"/>
                 <wp:positionH relativeFrom="column">
                   <wp:posOffset>291677</wp:posOffset>
@@ -17976,7 +17976,7 @@
           </mc:Choice>
           <mc:Fallback>
             <w:pict>
-              <v:shape w14:anchorId="75DCE107" id="Cuadro de texto 13" o:spid="_x0000_s1029" type="#_x0000_t202" style="position:absolute;left:0;text-align:left;margin-left:22.95pt;margin-top:76.8pt;width:138pt;height:26.65pt;z-index:251706880;visibility:visible;mso-wrap-style:square;mso-width-percent:0;mso-height-percent:0;mso-wrap-distance-left:9pt;mso-wrap-distance-top:0;mso-wrap-distance-right:9pt;mso-wrap-distance-bottom:0;mso-position-horizontal:absolute;mso-position-horizontal-relative:text;mso-position-vertical:absolute;mso-position-vertical-relative:text;mso-width-percent:0;mso-height-percent:0;mso-width-relative:margin;mso-height-relative:margin;v-text-anchor:top" o:gfxdata="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" fillcolor="white [3201]" stroked="f" strokeweight=".5pt">
+              <v:shape w14:anchorId="75DCE107" id="Cuadro de texto 13" o:spid="_x0000_s1029" type="#_x0000_t202" style="position:absolute;left:0;text-align:left;margin-left:22.95pt;margin-top:76.8pt;width:138pt;height:26.65pt;z-index:251658337;visibility:visible;mso-wrap-style:square;mso-width-percent:0;mso-height-percent:0;mso-wrap-distance-left:9pt;mso-wrap-distance-top:0;mso-wrap-distance-right:9pt;mso-wrap-distance-bottom:0;mso-position-horizontal:absolute;mso-position-horizontal-relative:text;mso-position-vertical:absolute;mso-position-vertical-relative:text;mso-width-percent:0;mso-height-percent:0;mso-width-relative:margin;mso-height-relative:margin;v-text-anchor:top" o:gfxdata="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" fillcolor="white [3201]" stroked="f" strokeweight=".5pt">
                 <v:textbox>
                   <w:txbxContent>
                     <w:p>
@@ -18012,7 +18012,7 @@
         <mc:AlternateContent>
           <mc:Choice Requires="wps">
             <w:drawing>
-              <wp:anchor distT="0" distB="0" distL="114300" distR="114300" simplePos="0" relativeHeight="251705856" behindDoc="0" locked="0" layoutInCell="1" allowOverlap="1" wp14:anchorId="2A6B038C" wp14:editId="07777777">
+              <wp:anchor distT="0" distB="0" distL="114300" distR="114300" simplePos="0" relativeHeight="251658336" behindDoc="0" locked="0" layoutInCell="1" allowOverlap="1" wp14:anchorId="2A6B038C" wp14:editId="07777777">
                 <wp:simplePos x="0" y="0"/>
                 <wp:positionH relativeFrom="column">
                   <wp:posOffset>2087033</wp:posOffset>
@@ -18086,7 +18086,7 @@
         <mc:AlternateContent>
           <mc:Choice Requires="wps">
             <w:drawing>
-              <wp:anchor distT="0" distB="0" distL="114300" distR="114300" simplePos="0" relativeHeight="251703808" behindDoc="0" locked="0" layoutInCell="1" allowOverlap="1" wp14:anchorId="4CF907C1" wp14:editId="07777777">
+              <wp:anchor distT="0" distB="0" distL="114300" distR="114300" simplePos="0" relativeHeight="251658334" behindDoc="0" locked="0" layoutInCell="1" allowOverlap="1" wp14:anchorId="4CF907C1" wp14:editId="07777777">
                 <wp:simplePos x="0" y="0"/>
                 <wp:positionH relativeFrom="column">
                   <wp:posOffset>-55245</wp:posOffset>
@@ -18232,16 +18232,16 @@
         <mc:AlternateContent>
           <mc:Choice Requires="wps">
             <w:drawing>
-              <wp:anchor distT="0" distB="0" distL="114300" distR="114300" simplePos="0" relativeHeight="251723264" behindDoc="0" locked="0" layoutInCell="1" allowOverlap="1" wp14:anchorId="29D67451" wp14:editId="654CAA85">
+              <wp:anchor distT="0" distB="0" distL="114300" distR="114300" simplePos="0" relativeHeight="251658347" behindDoc="0" locked="0" layoutInCell="1" allowOverlap="1" wp14:anchorId="29D67451" wp14:editId="0A7CCE57">
                 <wp:simplePos x="0" y="0"/>
                 <wp:positionH relativeFrom="column">
-                  <wp:posOffset>2839541</wp:posOffset>
+                  <wp:posOffset>2774314</wp:posOffset>
                 </wp:positionH>
                 <wp:positionV relativeFrom="paragraph">
-                  <wp:posOffset>8140102</wp:posOffset>
+                  <wp:posOffset>8137524</wp:posOffset>
                 </wp:positionV>
-                <wp:extent cx="1227667" cy="164133"/>
-                <wp:effectExtent l="0" t="0" r="10795" b="7620"/>
+                <wp:extent cx="2766753" cy="188457"/>
+                <wp:effectExtent l="0" t="0" r="14605" b="2540"/>
                 <wp:wrapNone/>
                 <wp:docPr id="1548226642" name="Text Box 368"/>
                 <wp:cNvGraphicFramePr>
@@ -18256,7 +18256,7 @@
                       <wps:spPr bwMode="auto">
                         <a:xfrm>
                           <a:off x="0" y="0"/>
-                          <a:ext cx="1227667" cy="164133"/>
+                          <a:ext cx="2766753" cy="188457"/>
                         </a:xfrm>
                         <a:prstGeom prst="rect">
                           <a:avLst/>
@@ -18348,7 +18348,7 @@
           </mc:Choice>
           <mc:Fallback>
             <w:pict>
-              <v:shape w14:anchorId="29D67451" id="Text Box 368" o:spid="_x0000_s1030" type="#_x0000_t202" style="position:absolute;left:0;text-align:left;margin-left:223.6pt;margin-top:640.95pt;width:96.65pt;height:12.9pt;z-index:251723264;visibility:visible;mso-wrap-style:square;mso-width-percent:0;mso-height-percent:0;mso-wrap-distance-left:9pt;mso-wrap-distance-top:0;mso-wrap-distance-right:9pt;mso-wrap-distance-bottom:0;mso-position-horizontal:absolute;mso-position-horizontal-relative:text;mso-position-vertical:absolute;mso-position-vertical-relative:text;mso-width-percent:0;mso-height-percent:0;mso-width-relative:margin;mso-height-relative:margin;v-text-anchor:top" o:gfxdata="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" filled="f" stroked="f">
+              <v:shape w14:anchorId="29D67451" id="Text Box 368" o:spid="_x0000_s1030" type="#_x0000_t202" style="position:absolute;left:0;text-align:left;margin-left:218.45pt;margin-top:640.75pt;width:217.85pt;height:14.85pt;z-index:251658347;visibility:visible;mso-wrap-style:square;mso-width-percent:0;mso-height-percent:0;mso-wrap-distance-left:9pt;mso-wrap-distance-top:0;mso-wrap-distance-right:9pt;mso-wrap-distance-bottom:0;mso-position-horizontal:absolute;mso-position-horizontal-relative:text;mso-position-vertical:absolute;mso-position-vertical-relative:text;mso-width-percent:0;mso-height-percent:0;mso-width-relative:margin;mso-height-relative:margin;v-text-anchor:top" o:gfxdata="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" filled="f" stroked="f">
                 <v:textbox inset="0,0,0,0">
                   <w:txbxContent>
                     <w:p>
@@ -18407,7 +18407,7 @@
         <mc:AlternateContent>
           <mc:Choice Requires="wps">
             <w:drawing>
-              <wp:anchor distT="0" distB="0" distL="114300" distR="114300" simplePos="0" relativeHeight="251719168" behindDoc="0" locked="0" layoutInCell="1" allowOverlap="1" wp14:anchorId="1D2B9A2F" wp14:editId="48A64CBF">
+              <wp:anchor distT="0" distB="0" distL="114300" distR="114300" simplePos="0" relativeHeight="251658345" behindDoc="0" locked="0" layoutInCell="1" allowOverlap="1" wp14:anchorId="1D2B9A2F" wp14:editId="48A64CBF">
                 <wp:simplePos x="0" y="0"/>
                 <wp:positionH relativeFrom="column">
                   <wp:posOffset>1912994</wp:posOffset>
@@ -18521,7 +18521,7 @@
           </mc:Choice>
           <mc:Fallback>
             <w:pict>
-              <v:shape w14:anchorId="1D2B9A2F" id="_x0000_s1031" type="#_x0000_t202" style="position:absolute;left:0;text-align:left;margin-left:150.65pt;margin-top:450.85pt;width:51pt;height:12.9pt;z-index:251719168;visibility:visible;mso-wrap-style:square;mso-width-percent:0;mso-height-percent:0;mso-wrap-distance-left:9pt;mso-wrap-distance-top:0;mso-wrap-distance-right:9pt;mso-wrap-distance-bottom:0;mso-position-horizontal:absolute;mso-position-horizontal-relative:text;mso-position-vertical:absolute;mso-position-vertical-relative:text;mso-width-percent:0;mso-height-percent:0;mso-width-relative:margin;mso-height-relative:margin;v-text-anchor:top" o:gfxdata="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" filled="f" stroked="f">
+              <v:shape w14:anchorId="1D2B9A2F" id="_x0000_s1031" type="#_x0000_t202" style="position:absolute;left:0;text-align:left;margin-left:150.65pt;margin-top:450.85pt;width:51pt;height:12.9pt;z-index:251658345;visibility:visible;mso-wrap-style:square;mso-width-percent:0;mso-height-percent:0;mso-wrap-distance-left:9pt;mso-wrap-distance-top:0;mso-wrap-distance-right:9pt;mso-wrap-distance-bottom:0;mso-position-horizontal:absolute;mso-position-horizontal-relative:text;mso-position-vertical:absolute;mso-position-vertical-relative:text;mso-width-percent:0;mso-height-percent:0;mso-width-relative:margin;mso-height-relative:margin;v-text-anchor:top" o:gfxdata="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" filled="f" stroked="f">
                 <v:textbox inset="0,0,0,0">
                   <w:txbxContent>
                     <w:p>
@@ -18578,7 +18578,7 @@
         <mc:AlternateContent>
           <mc:Choice Requires="wps">
             <w:drawing>
-              <wp:anchor distT="0" distB="0" distL="114300" distR="114300" simplePos="0" relativeHeight="251717120" behindDoc="0" locked="0" layoutInCell="1" allowOverlap="1" wp14:anchorId="20FD1FFB" wp14:editId="6645AFCF">
+              <wp:anchor distT="0" distB="0" distL="114300" distR="114300" simplePos="0" relativeHeight="251658344" behindDoc="0" locked="0" layoutInCell="1" allowOverlap="1" wp14:anchorId="20FD1FFB" wp14:editId="6645AFCF">
                 <wp:simplePos x="0" y="0"/>
                 <wp:positionH relativeFrom="column">
                   <wp:posOffset>157480</wp:posOffset>
@@ -18678,7 +18678,7 @@
           </mc:Choice>
           <mc:Fallback>
             <w:pict>
-              <v:shape w14:anchorId="20FD1FFB" id="_x0000_s1032" type="#_x0000_t202" style="position:absolute;left:0;text-align:left;margin-left:12.4pt;margin-top:450.5pt;width:51pt;height:12.9pt;z-index:251717120;visibility:visible;mso-wrap-style:square;mso-width-percent:0;mso-height-percent:0;mso-wrap-distance-left:9pt;mso-wrap-distance-top:0;mso-wrap-distance-right:9pt;mso-wrap-distance-bottom:0;mso-position-horizontal:absolute;mso-position-horizontal-relative:text;mso-position-vertical:absolute;mso-position-vertical-relative:text;mso-width-percent:0;mso-height-percent:0;mso-width-relative:margin;mso-height-relative:margin;v-text-anchor:top" o:gfxdata="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" filled="f" stroked="f">
+              <v:shape w14:anchorId="20FD1FFB" id="_x0000_s1032" type="#_x0000_t202" style="position:absolute;left:0;text-align:left;margin-left:12.4pt;margin-top:450.5pt;width:51pt;height:12.9pt;z-index:251658344;visibility:visible;mso-wrap-style:square;mso-width-percent:0;mso-height-percent:0;mso-wrap-distance-left:9pt;mso-wrap-distance-top:0;mso-wrap-distance-right:9pt;mso-wrap-distance-bottom:0;mso-position-horizontal:absolute;mso-position-horizontal-relative:text;mso-position-vertical:absolute;mso-position-vertical-relative:text;mso-width-percent:0;mso-height-percent:0;mso-width-relative:margin;mso-height-relative:margin;v-text-anchor:top" o:gfxdata="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" filled="f" stroked="f">
                 <v:textbox inset="0,0,0,0">
                   <w:txbxContent>
                     <w:p>
@@ -18721,7 +18721,7 @@
         <mc:AlternateContent>
           <mc:Choice Requires="wps">
             <w:drawing>
-              <wp:anchor distT="0" distB="0" distL="114300" distR="114300" simplePos="0" relativeHeight="251721216" behindDoc="0" locked="0" layoutInCell="1" allowOverlap="1" wp14:anchorId="09967639" wp14:editId="4B7B4230">
+              <wp:anchor distT="0" distB="0" distL="114300" distR="114300" simplePos="0" relativeHeight="251658346" behindDoc="0" locked="0" layoutInCell="1" allowOverlap="1" wp14:anchorId="09967639" wp14:editId="4B7B4230">
                 <wp:simplePos x="0" y="0"/>
                 <wp:positionH relativeFrom="column">
                   <wp:posOffset>2882264</wp:posOffset>
@@ -18835,7 +18835,7 @@
           </mc:Choice>
           <mc:Fallback>
             <w:pict>
-              <v:shape w14:anchorId="09967639" id="_x0000_s1033" type="#_x0000_t202" style="position:absolute;left:0;text-align:left;margin-left:226.95pt;margin-top:451.1pt;width:55.55pt;height:12.9pt;z-index:251721216;visibility:visible;mso-wrap-style:square;mso-width-percent:0;mso-height-percent:0;mso-wrap-distance-left:9pt;mso-wrap-distance-top:0;mso-wrap-distance-right:9pt;mso-wrap-distance-bottom:0;mso-position-horizontal:absolute;mso-position-horizontal-relative:text;mso-position-vertical:absolute;mso-position-vertical-relative:text;mso-width-percent:0;mso-height-percent:0;mso-width-relative:margin;mso-height-relative:margin;v-text-anchor:top" o:gfxdata="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" filled="f" stroked="f">
+              <v:shape w14:anchorId="09967639" id="_x0000_s1033" type="#_x0000_t202" style="position:absolute;left:0;text-align:left;margin-left:226.95pt;margin-top:451.1pt;width:55.55pt;height:12.9pt;z-index:251658346;visibility:visible;mso-wrap-style:square;mso-width-percent:0;mso-height-percent:0;mso-wrap-distance-left:9pt;mso-wrap-distance-top:0;mso-wrap-distance-right:9pt;mso-wrap-distance-bottom:0;mso-position-horizontal:absolute;mso-position-horizontal-relative:text;mso-position-vertical:absolute;mso-position-vertical-relative:text;mso-width-percent:0;mso-height-percent:0;mso-width-relative:margin;mso-height-relative:margin;v-text-anchor:top" o:gfxdata="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" filled="f" stroked="f">
                 <v:textbox inset="0,0,0,0">
                   <w:txbxContent>
                     <w:p>
@@ -18892,7 +18892,7 @@
         <mc:AlternateContent>
           <mc:Choice Requires="wps">
             <w:drawing>
-              <wp:anchor distT="0" distB="0" distL="114300" distR="114300" simplePos="0" relativeHeight="251715072" behindDoc="0" locked="0" layoutInCell="1" allowOverlap="1" wp14:anchorId="689620A2" wp14:editId="5A3A4077">
+              <wp:anchor distT="0" distB="0" distL="114300" distR="114300" simplePos="0" relativeHeight="251658343" behindDoc="0" locked="0" layoutInCell="1" allowOverlap="1" wp14:anchorId="689620A2" wp14:editId="5A3A4077">
                 <wp:simplePos x="0" y="0"/>
                 <wp:positionH relativeFrom="column">
                   <wp:posOffset>3644265</wp:posOffset>
@@ -18989,7 +18989,7 @@
           </mc:Choice>
           <mc:Fallback>
             <w:pict>
-              <v:shape w14:anchorId="689620A2" id="_x0000_s1034" type="#_x0000_t202" style="position:absolute;left:0;text-align:left;margin-left:286.95pt;margin-top:408.75pt;width:33.85pt;height:11pt;z-index:251715072;visibility:visible;mso-wrap-style:square;mso-width-percent:0;mso-height-percent:0;mso-wrap-distance-left:9pt;mso-wrap-distance-top:0;mso-wrap-distance-right:9pt;mso-wrap-distance-bottom:0;mso-position-horizontal:absolute;mso-position-horizontal-relative:text;mso-position-vertical:absolute;mso-position-vertical-relative:text;mso-width-percent:0;mso-height-percent:0;mso-width-relative:margin;mso-height-relative:margin;v-text-anchor:top" o:gfxdata="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" filled="f" stroked="f">
+              <v:shape w14:anchorId="689620A2" id="_x0000_s1034" type="#_x0000_t202" style="position:absolute;left:0;text-align:left;margin-left:286.95pt;margin-top:408.75pt;width:33.85pt;height:11pt;z-index:251658343;visibility:visible;mso-wrap-style:square;mso-width-percent:0;mso-height-percent:0;mso-wrap-distance-left:9pt;mso-wrap-distance-top:0;mso-wrap-distance-right:9pt;mso-wrap-distance-bottom:0;mso-position-horizontal:absolute;mso-position-horizontal-relative:text;mso-position-vertical:absolute;mso-position-vertical-relative:text;mso-width-percent:0;mso-height-percent:0;mso-width-relative:margin;mso-height-relative:margin;v-text-anchor:top" o:gfxdata="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" filled="f" stroked="f">
                 <v:textbox inset="0,0,0,0">
                   <w:txbxContent>
                     <w:p>
@@ -19031,7 +19031,7 @@
         <mc:AlternateContent>
           <mc:Choice Requires="wpg">
             <w:drawing>
-              <wp:anchor distT="0" distB="0" distL="114300" distR="114300" simplePos="0" relativeHeight="251713024" behindDoc="1" locked="0" layoutInCell="1" allowOverlap="1" wp14:anchorId="1C946615" wp14:editId="300A2C4E">
+              <wp:anchor distT="0" distB="0" distL="114300" distR="114300" simplePos="0" relativeHeight="251658342" behindDoc="1" locked="0" layoutInCell="1" allowOverlap="1" wp14:anchorId="1C946615" wp14:editId="300A2C4E">
                 <wp:simplePos x="0" y="0"/>
                 <wp:positionH relativeFrom="margin">
                   <wp:posOffset>14182</wp:posOffset>
@@ -27027,7 +27027,7 @@
           </mc:Choice>
           <mc:Fallback>
             <w:pict>
-              <v:group w14:anchorId="1C946615" id="Grupo 106" o:spid="_x0000_s1035" style="position:absolute;left:0;text-align:left;margin-left:1.1pt;margin-top:369.9pt;width:439.95pt;height:303.25pt;z-index:-251603456;mso-position-horizontal-relative:margin;mso-width-relative:margin;mso-height-relative:margin" coordorigin="23,23" coordsize="9581,6654" o:gfxdata="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">
+              <v:group w14:anchorId="1C946615" id="Grupo 106" o:spid="_x0000_s1035" style="position:absolute;left:0;text-align:left;margin-left:1.1pt;margin-top:369.9pt;width:439.95pt;height:303.25pt;z-index:-251658138;mso-position-horizontal-relative:margin;mso-width-relative:margin;mso-height-relative:margin" coordorigin="23,23" coordsize="9581,6654" o:gfxdata="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">
                 <v:group id="Group 193" o:spid="_x0000_s1036" style="position:absolute;left:7147;top:900;width:2327;height:2" coordorigin="7147,900" coordsize="2327,2" o:gfxdata="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">
                   <v:shape id="Freeform 194" o:spid="_x0000_s1037" style="position:absolute;left:7147;top:900;width:2327;height:2;visibility:visible;mso-wrap-style:square;v-text-anchor:top" coordsize="2327,2" o:gfxdata="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" path="m,l2327,e" filled="f" strokeweight="1.06pt">
                     <v:path arrowok="t" o:connecttype="custom" o:connectlocs="0,0;2327,0" o:connectangles="0,0"/>
@@ -27950,7 +27950,7 @@
           <w:lang w:val="es-MX" w:eastAsia="es-MX"/>
         </w:rPr>
         <w:drawing>
-          <wp:anchor distT="0" distB="0" distL="114300" distR="114300" simplePos="0" relativeHeight="251712000" behindDoc="1" locked="0" layoutInCell="1" allowOverlap="1" wp14:anchorId="33101901" wp14:editId="54BDDD17">
+          <wp:anchor distT="0" distB="0" distL="114300" distR="114300" simplePos="0" relativeHeight="251658341" behindDoc="1" locked="0" layoutInCell="1" allowOverlap="1" wp14:anchorId="33101901" wp14:editId="54BDDD17">
             <wp:simplePos x="0" y="0"/>
             <wp:positionH relativeFrom="margin">
               <wp:align>center</wp:align>
@@ -28151,7 +28151,7 @@
         <v:path o:extrusionok="f" gradientshapeok="t" o:connecttype="rect"/>
         <o:lock v:ext="edit" aspectratio="t"/>
       </v:shapetype>
-      <v:shape id="Imagen 108" o:spid="_x0000_i1025" type="#_x0000_t75" style="width:61.8pt;height:19.8pt;visibility:visible;mso-wrap-style:square" o:bullet="t">
+      <v:shape id="Imagen 108" o:spid="_x0000_i1025" type="#_x0000_t75" style="width:62pt;height:20pt;visibility:visible;mso-wrap-style:square" o:bullet="t">
         <v:imagedata r:id="rId1" o:title=""/>
       </v:shape>
     </w:pict>

</xml_diff>